<commit_message>
merged the two functions
</commit_message>
<xml_diff>
--- a/template.docx
+++ b/template.docx
@@ -591,7 +591,85 @@
           <w:sz w:val="22"/>
           <w:szCs w:val="22"/>
         </w:rPr>
-        <w:t>: N/A</w:t>
+        <w:t xml:space="preserve">: </w:t>
+      </w:r>
+      <w:proofErr w:type="gramStart"/>
+      <w:r>
+        <w:rPr>
+          <w:rFonts w:ascii="Arial" w:hAnsi="Arial" w:cs="Arial"/>
+          <w:sz w:val="22"/>
+          <w:szCs w:val="22"/>
+        </w:rPr>
+        <w:t>{{ data</w:t>
+      </w:r>
+      <w:proofErr w:type="gramEnd"/>
+      <w:r>
+        <w:rPr>
+          <w:rFonts w:ascii="Arial" w:hAnsi="Arial" w:cs="Arial"/>
+          <w:sz w:val="22"/>
+          <w:szCs w:val="22"/>
+        </w:rPr>
+        <w:t>[0].</w:t>
+      </w:r>
+      <w:proofErr w:type="spellStart"/>
+      <w:r>
+        <w:rPr>
+          <w:rFonts w:ascii="Arial" w:hAnsi="Arial" w:cs="Arial"/>
+          <w:sz w:val="22"/>
+          <w:szCs w:val="22"/>
+        </w:rPr>
+        <w:t>Mois_de_Consomation</w:t>
+      </w:r>
+      <w:proofErr w:type="spellEnd"/>
+      <w:r>
+        <w:rPr>
+          <w:rFonts w:ascii="Arial" w:hAnsi="Arial" w:cs="Arial"/>
+          <w:sz w:val="22"/>
+          <w:szCs w:val="22"/>
+        </w:rPr>
+        <w:t xml:space="preserve">}} à </w:t>
+      </w:r>
+      <w:r>
+        <w:rPr>
+          <w:rFonts w:ascii="Arial" w:hAnsi="Arial" w:cs="Arial"/>
+          <w:sz w:val="22"/>
+          <w:szCs w:val="22"/>
+        </w:rPr>
+        <w:t>{{ data[</w:t>
+      </w:r>
+      <w:r>
+        <w:rPr>
+          <w:rFonts w:ascii="Arial" w:hAnsi="Arial" w:cs="Arial"/>
+          <w:sz w:val="22"/>
+          <w:szCs w:val="22"/>
+        </w:rPr>
+        <w:t>-1</w:t>
+      </w:r>
+      <w:r>
+        <w:rPr>
+          <w:rFonts w:ascii="Arial" w:hAnsi="Arial" w:cs="Arial"/>
+          <w:sz w:val="22"/>
+          <w:szCs w:val="22"/>
+        </w:rPr>
+        <w:t>].</w:t>
+      </w:r>
+      <w:proofErr w:type="spellStart"/>
+      <w:r>
+        <w:rPr>
+          <w:rFonts w:ascii="Arial" w:hAnsi="Arial" w:cs="Arial"/>
+          <w:sz w:val="22"/>
+          <w:szCs w:val="22"/>
+        </w:rPr>
+        <w:t>Mois_de_Consomation</w:t>
+      </w:r>
+      <w:proofErr w:type="spellEnd"/>
+      <w:r>
+        <w:rPr>
+          <w:rFonts w:ascii="Arial" w:hAnsi="Arial" w:cs="Arial"/>
+          <w:sz w:val="22"/>
+          <w:szCs w:val="22"/>
+        </w:rPr>
+        <w:t>}}</w:t>
       </w:r>
     </w:p>
     <w:p>
@@ -2104,34 +2182,6 @@
         </w:tabs>
         <w:rPr>
           <w:rFonts w:ascii="Arial" w:hAnsi="Arial" w:cs="Arial"/>
-          <w:b/>
-          <w:bCs/>
-          <w:sz w:val="24"/>
-          <w:szCs w:val="24"/>
-          <w:lang w:val="en-US"/>
-        </w:rPr>
-      </w:pPr>
-      <w:r>
-        <w:rPr>
-          <w:rFonts w:ascii="Arial" w:hAnsi="Arial" w:cs="Arial"/>
-          <w:b/>
-          <w:bCs/>
-          <w:sz w:val="24"/>
-          <w:szCs w:val="24"/>
-          <w:lang w:val="en-US"/>
-        </w:rPr>
-        <w:t>{% for item in data %}</w:t>
-      </w:r>
-    </w:p>
-    <w:p>
-      <w:pPr>
-        <w:shd w:val="clear" w:color="auto" w:fill="FFFFFF"/>
-        <w:tabs>
-          <w:tab w:val="left" w:pos="4249"/>
-          <w:tab w:val="left" w:pos="5824"/>
-        </w:tabs>
-        <w:rPr>
-          <w:rFonts w:ascii="Arial" w:hAnsi="Arial" w:cs="Arial"/>
           <w:sz w:val="22"/>
           <w:szCs w:val="22"/>
           <w:lang w:val="en-US"/>
@@ -2153,16 +2203,207 @@
         <w:tblLook w:val="04A0" w:firstRow="1" w:lastRow="0" w:firstColumn="1" w:lastColumn="0" w:noHBand="0" w:noVBand="1"/>
       </w:tblPr>
       <w:tblGrid>
-        <w:gridCol w:w="3417"/>
-        <w:gridCol w:w="3437"/>
+        <w:gridCol w:w="2689"/>
+        <w:gridCol w:w="3274"/>
       </w:tblGrid>
       <w:tr>
         <w:trPr>
-          <w:trHeight w:val="431"/>
+          <w:trHeight w:val="503"/>
         </w:trPr>
         <w:tc>
           <w:tcPr>
-            <w:tcW w:w="3417" w:type="dxa"/>
+            <w:tcW w:w="2689" w:type="dxa"/>
+            <w:shd w:val="clear" w:color="auto" w:fill="auto"/>
+            <w:vAlign w:val="center"/>
+          </w:tcPr>
+          <w:p>
+            <w:pPr>
+              <w:shd w:val="clear" w:color="auto" w:fill="FFFFFF"/>
+              <w:tabs>
+                <w:tab w:val="left" w:pos="4249"/>
+                <w:tab w:val="left" w:pos="5824"/>
+              </w:tabs>
+              <w:rPr>
+                <w:rFonts w:ascii="Arial" w:hAnsi="Arial" w:cs="Arial"/>
+                <w:b/>
+                <w:szCs w:val="22"/>
+                <w:lang w:val="en-US"/>
+              </w:rPr>
+            </w:pPr>
+            <w:r>
+              <w:rPr>
+                <w:rFonts w:ascii="Arial" w:hAnsi="Arial" w:cs="Arial"/>
+                <w:b/>
+                <w:szCs w:val="22"/>
+                <w:lang w:val="en-US"/>
+              </w:rPr>
+              <w:t xml:space="preserve">                  </w:t>
+            </w:r>
+            <w:proofErr w:type="spellStart"/>
+            <w:r>
+              <w:rPr>
+                <w:rFonts w:ascii="Arial" w:hAnsi="Arial" w:cs="Arial"/>
+                <w:b/>
+                <w:szCs w:val="22"/>
+                <w:lang w:val="en-US"/>
+              </w:rPr>
+              <w:t>Mois</w:t>
+            </w:r>
+            <w:proofErr w:type="spellEnd"/>
+          </w:p>
+          <w:p>
+            <w:pPr>
+              <w:shd w:val="clear" w:color="auto" w:fill="FFFFFF"/>
+              <w:tabs>
+                <w:tab w:val="left" w:pos="4249"/>
+                <w:tab w:val="left" w:pos="5824"/>
+              </w:tabs>
+              <w:rPr>
+                <w:rFonts w:ascii="Arial" w:hAnsi="Arial" w:cs="Arial"/>
+                <w:b/>
+                <w:bCs/>
+                <w:sz w:val="24"/>
+                <w:szCs w:val="24"/>
+                <w:lang w:val="en-US"/>
+              </w:rPr>
+            </w:pPr>
+            <w:r>
+              <w:rPr>
+                <w:rFonts w:ascii="Arial" w:hAnsi="Arial" w:cs="Arial"/>
+                <w:b/>
+                <w:bCs/>
+                <w:sz w:val="24"/>
+                <w:szCs w:val="24"/>
+                <w:lang w:val="en-US"/>
+              </w:rPr>
+              <w:t>{% for item in data %}</w:t>
+            </w:r>
+          </w:p>
+          <w:p>
+            <w:pPr>
+              <w:autoSpaceDE w:val="0"/>
+              <w:autoSpaceDN w:val="0"/>
+              <w:adjustRightInd w:val="0"/>
+              <w:jc w:val="center"/>
+              <w:rPr>
+                <w:rFonts w:ascii="Arial" w:hAnsi="Arial" w:cs="Arial"/>
+                <w:b/>
+                <w:szCs w:val="22"/>
+                <w:lang w:val="en-US"/>
+              </w:rPr>
+            </w:pPr>
+          </w:p>
+        </w:tc>
+        <w:tc>
+          <w:tcPr>
+            <w:tcW w:w="3274" w:type="dxa"/>
+          </w:tcPr>
+          <w:p>
+            <w:pPr>
+              <w:shd w:val="clear" w:color="auto" w:fill="FFFFFF"/>
+              <w:tabs>
+                <w:tab w:val="left" w:pos="4249"/>
+                <w:tab w:val="left" w:pos="5824"/>
+              </w:tabs>
+              <w:rPr>
+                <w:rFonts w:ascii="Arial" w:hAnsi="Arial" w:cs="Arial"/>
+                <w:b/>
+                <w:bCs/>
+                <w:sz w:val="24"/>
+                <w:szCs w:val="24"/>
+                <w:lang w:val="fr-MA"/>
+              </w:rPr>
+            </w:pPr>
+            <w:proofErr w:type="gramStart"/>
+            <w:r>
+              <w:rPr>
+                <w:rFonts w:ascii="Arial" w:hAnsi="Arial" w:cs="Arial"/>
+                <w:bCs/>
+                <w:szCs w:val="22"/>
+                <w:lang w:val="fr-MA"/>
+              </w:rPr>
+              <w:t xml:space="preserve">{{ </w:t>
+            </w:r>
+            <w:proofErr w:type="spellStart"/>
+            <w:r>
+              <w:rPr>
+                <w:rFonts w:ascii="Arial" w:hAnsi="Arial" w:cs="Arial"/>
+                <w:bCs/>
+                <w:szCs w:val="22"/>
+                <w:lang w:val="fr-MA"/>
+              </w:rPr>
+              <w:t>item</w:t>
+            </w:r>
+            <w:proofErr w:type="gramEnd"/>
+            <w:r>
+              <w:rPr>
+                <w:rFonts w:ascii="Arial" w:hAnsi="Arial" w:cs="Arial"/>
+                <w:bCs/>
+                <w:szCs w:val="22"/>
+                <w:lang w:val="fr-MA"/>
+              </w:rPr>
+              <w:t>.Mois_de_Consomation</w:t>
+            </w:r>
+            <w:proofErr w:type="spellEnd"/>
+            <w:r>
+              <w:rPr>
+                <w:rFonts w:ascii="Arial" w:hAnsi="Arial" w:cs="Arial"/>
+                <w:bCs/>
+                <w:szCs w:val="22"/>
+                <w:lang w:val="fr-MA"/>
+              </w:rPr>
+              <w:t>}}</w:t>
+            </w:r>
+          </w:p>
+          <w:p>
+            <w:pPr>
+              <w:autoSpaceDE w:val="0"/>
+              <w:autoSpaceDN w:val="0"/>
+              <w:adjustRightInd w:val="0"/>
+              <w:jc w:val="center"/>
+              <w:rPr>
+                <w:rFonts w:ascii="Arial" w:hAnsi="Arial" w:cs="Arial"/>
+                <w:bCs/>
+                <w:szCs w:val="22"/>
+                <w:lang w:val="fr-MA"/>
+              </w:rPr>
+            </w:pPr>
+            <w:r>
+              <w:rPr>
+                <w:rFonts w:ascii="Arial" w:hAnsi="Arial" w:cs="Arial"/>
+                <w:sz w:val="22"/>
+                <w:szCs w:val="22"/>
+              </w:rPr>
+              <w:t xml:space="preserve">{% </w:t>
+            </w:r>
+            <w:proofErr w:type="spellStart"/>
+            <w:r>
+              <w:rPr>
+                <w:rFonts w:ascii="Arial" w:hAnsi="Arial" w:cs="Arial"/>
+                <w:sz w:val="22"/>
+                <w:szCs w:val="22"/>
+              </w:rPr>
+              <w:t>endfor</w:t>
+            </w:r>
+            <w:proofErr w:type="spellEnd"/>
+            <w:r>
+              <w:rPr>
+                <w:rFonts w:ascii="Arial" w:hAnsi="Arial" w:cs="Arial"/>
+                <w:sz w:val="22"/>
+                <w:szCs w:val="22"/>
+              </w:rPr>
+              <w:t xml:space="preserve"> %}</w:t>
+            </w:r>
+          </w:p>
+        </w:tc>
+      </w:tr>
+      <w:tr>
+        <w:trPr>
+          <w:trHeight w:val="595"/>
+        </w:trPr>
+        <w:tc>
+          <w:tcPr>
+            <w:tcW w:w="2689" w:type="dxa"/>
             <w:shd w:val="clear" w:color="auto" w:fill="auto"/>
             <w:vAlign w:val="center"/>
           </w:tcPr>
@@ -2176,6 +2417,7 @@
                 <w:rFonts w:ascii="Arial" w:hAnsi="Arial" w:cs="Arial"/>
                 <w:b/>
                 <w:szCs w:val="22"/>
+                <w:lang w:val="en-US"/>
               </w:rPr>
             </w:pPr>
             <w:r>
@@ -2183,15 +2425,90 @@
                 <w:rFonts w:ascii="Arial" w:hAnsi="Arial" w:cs="Arial"/>
                 <w:b/>
                 <w:szCs w:val="22"/>
-              </w:rPr>
-              <w:t>Mois</w:t>
-            </w:r>
+                <w:lang w:val="en-US"/>
+              </w:rPr>
+              <w:t xml:space="preserve">Puissance </w:t>
+            </w:r>
+            <w:proofErr w:type="spellStart"/>
+            <w:r>
+              <w:rPr>
+                <w:rFonts w:ascii="Arial" w:hAnsi="Arial" w:cs="Arial"/>
+                <w:b/>
+                <w:szCs w:val="22"/>
+                <w:lang w:val="en-US"/>
+              </w:rPr>
+              <w:t>Souscrite</w:t>
+            </w:r>
+            <w:proofErr w:type="spellEnd"/>
+          </w:p>
+          <w:p>
+            <w:pPr>
+              <w:autoSpaceDE w:val="0"/>
+              <w:autoSpaceDN w:val="0"/>
+              <w:adjustRightInd w:val="0"/>
+              <w:jc w:val="center"/>
+              <w:rPr>
+                <w:rFonts w:ascii="Arial" w:hAnsi="Arial" w:cs="Arial"/>
+                <w:b/>
+                <w:szCs w:val="22"/>
+                <w:lang w:val="en-US"/>
+              </w:rPr>
+            </w:pPr>
+            <w:r>
+              <w:rPr>
+                <w:rFonts w:ascii="Arial" w:hAnsi="Arial" w:cs="Arial"/>
+                <w:b/>
+                <w:szCs w:val="22"/>
+                <w:lang w:val="en-US"/>
+              </w:rPr>
+              <w:t>KVA</w:t>
+            </w:r>
+          </w:p>
+          <w:p>
+            <w:pPr>
+              <w:shd w:val="clear" w:color="auto" w:fill="FFFFFF"/>
+              <w:tabs>
+                <w:tab w:val="left" w:pos="4249"/>
+                <w:tab w:val="left" w:pos="5824"/>
+              </w:tabs>
+              <w:rPr>
+                <w:rFonts w:ascii="Arial" w:hAnsi="Arial" w:cs="Arial"/>
+                <w:b/>
+                <w:bCs/>
+                <w:sz w:val="24"/>
+                <w:szCs w:val="24"/>
+                <w:lang w:val="en-US"/>
+              </w:rPr>
+            </w:pPr>
+            <w:r>
+              <w:rPr>
+                <w:rFonts w:ascii="Arial" w:hAnsi="Arial" w:cs="Arial"/>
+                <w:b/>
+                <w:bCs/>
+                <w:sz w:val="24"/>
+                <w:szCs w:val="24"/>
+                <w:lang w:val="en-US"/>
+              </w:rPr>
+              <w:t>{% for item in data %}</w:t>
+            </w:r>
+          </w:p>
+          <w:p>
+            <w:pPr>
+              <w:autoSpaceDE w:val="0"/>
+              <w:autoSpaceDN w:val="0"/>
+              <w:adjustRightInd w:val="0"/>
+              <w:jc w:val="center"/>
+              <w:rPr>
+                <w:rFonts w:ascii="Arial" w:hAnsi="Arial" w:cs="Arial"/>
+                <w:szCs w:val="22"/>
+                <w:lang w:val="en-US"/>
+              </w:rPr>
+            </w:pPr>
           </w:p>
         </w:tc>
         <w:tc>
           <w:tcPr>
-            <w:tcW w:w="3437" w:type="dxa"/>
-            <w:vAlign w:val="center"/>
+            <w:tcW w:w="3274" w:type="dxa"/>
           </w:tcPr>
           <w:p>
             <w:pPr>
@@ -2200,84 +2517,46 @@
               <w:adjustRightInd w:val="0"/>
               <w:jc w:val="center"/>
               <w:rPr>
-                <w:rFonts w:ascii="Arial" w:hAnsi="Arial" w:cs="Arial"/>
-                <w:bCs/>
-                <w:szCs w:val="22"/>
-                <w:lang w:val="fr-MA"/>
+                <w:rFonts w:ascii="Calibri" w:hAnsi="Calibri" w:cs="Calibri"/>
+                <w:color w:val="000000"/>
+                <w:szCs w:val="18"/>
               </w:rPr>
             </w:pPr>
+            <w:r>
+              <w:rPr>
+                <w:rFonts w:ascii="Calibri" w:hAnsi="Calibri" w:cs="Calibri"/>
+                <w:color w:val="000000"/>
+                <w:szCs w:val="18"/>
+              </w:rPr>
+              <w:t>{{</w:t>
+            </w:r>
+            <w:proofErr w:type="spellStart"/>
             <w:proofErr w:type="gramStart"/>
             <w:r>
               <w:rPr>
-                <w:rFonts w:ascii="Arial" w:hAnsi="Arial" w:cs="Arial"/>
-                <w:bCs/>
-                <w:szCs w:val="22"/>
-                <w:lang w:val="fr-MA"/>
-              </w:rPr>
-              <w:t xml:space="preserve">{{ </w:t>
-            </w:r>
-            <w:proofErr w:type="spellStart"/>
-            <w:r>
-              <w:rPr>
-                <w:rFonts w:ascii="Arial" w:hAnsi="Arial" w:cs="Arial"/>
-                <w:bCs/>
-                <w:szCs w:val="22"/>
-                <w:lang w:val="fr-MA"/>
-              </w:rPr>
-              <w:t>item</w:t>
+                <w:rFonts w:ascii="Calibri" w:hAnsi="Calibri" w:cs="Calibri"/>
+                <w:color w:val="000000"/>
+                <w:szCs w:val="18"/>
+              </w:rPr>
+              <w:t>item.Puissance</w:t>
             </w:r>
             <w:proofErr w:type="gramEnd"/>
             <w:r>
               <w:rPr>
-                <w:rFonts w:ascii="Arial" w:hAnsi="Arial" w:cs="Arial"/>
-                <w:bCs/>
-                <w:szCs w:val="22"/>
-                <w:lang w:val="fr-MA"/>
-              </w:rPr>
-              <w:t>.Mois_de_Consomation</w:t>
+                <w:rFonts w:ascii="Calibri" w:hAnsi="Calibri" w:cs="Calibri"/>
+                <w:color w:val="000000"/>
+                <w:szCs w:val="18"/>
+              </w:rPr>
+              <w:t>_Souscrite.quantite</w:t>
             </w:r>
             <w:proofErr w:type="spellEnd"/>
             <w:r>
               <w:rPr>
-                <w:rFonts w:ascii="Arial" w:hAnsi="Arial" w:cs="Arial"/>
-                <w:bCs/>
-                <w:szCs w:val="22"/>
-                <w:lang w:val="fr-MA"/>
-              </w:rPr>
-              <w:t xml:space="preserve"> }}</w:t>
-            </w:r>
-          </w:p>
-        </w:tc>
-      </w:tr>
-      <w:tr>
-        <w:trPr>
-          <w:trHeight w:val="509"/>
-        </w:trPr>
-        <w:tc>
-          <w:tcPr>
-            <w:tcW w:w="3417" w:type="dxa"/>
-            <w:shd w:val="clear" w:color="auto" w:fill="auto"/>
-            <w:vAlign w:val="center"/>
-          </w:tcPr>
-          <w:p>
-            <w:pPr>
-              <w:autoSpaceDE w:val="0"/>
-              <w:autoSpaceDN w:val="0"/>
-              <w:adjustRightInd w:val="0"/>
-              <w:jc w:val="center"/>
-              <w:rPr>
-                <w:rFonts w:ascii="Arial" w:hAnsi="Arial" w:cs="Arial"/>
-                <w:b/>
-                <w:szCs w:val="22"/>
-              </w:rPr>
-            </w:pPr>
-            <w:r>
-              <w:rPr>
-                <w:rFonts w:ascii="Arial" w:hAnsi="Arial" w:cs="Arial"/>
-                <w:b/>
-                <w:szCs w:val="22"/>
-              </w:rPr>
-              <w:t>Puissance Souscrite</w:t>
+                <w:rFonts w:ascii="Calibri" w:hAnsi="Calibri" w:cs="Calibri"/>
+                <w:color w:val="000000"/>
+                <w:szCs w:val="18"/>
+              </w:rPr>
+              <w:t>}}</w:t>
             </w:r>
           </w:p>
           <w:p>
@@ -2287,72 +2566,18 @@
               <w:adjustRightInd w:val="0"/>
               <w:jc w:val="center"/>
               <w:rPr>
+                <w:rFonts w:ascii="Calibri" w:hAnsi="Calibri" w:cs="Calibri"/>
+                <w:color w:val="000000"/>
+                <w:szCs w:val="18"/>
+              </w:rPr>
+            </w:pPr>
+            <w:r>
+              <w:rPr>
                 <w:rFonts w:ascii="Arial" w:hAnsi="Arial" w:cs="Arial"/>
+                <w:sz w:val="22"/>
                 <w:szCs w:val="22"/>
               </w:rPr>
-            </w:pPr>
-            <w:r>
-              <w:rPr>
-                <w:rFonts w:ascii="Arial" w:hAnsi="Arial" w:cs="Arial"/>
-                <w:b/>
-                <w:szCs w:val="22"/>
-              </w:rPr>
-              <w:t>KVA</w:t>
-            </w:r>
-          </w:p>
-        </w:tc>
-        <w:tc>
-          <w:tcPr>
-            <w:tcW w:w="3437" w:type="dxa"/>
-            <w:vAlign w:val="center"/>
-          </w:tcPr>
-          <w:p>
-            <w:pPr>
-              <w:autoSpaceDE w:val="0"/>
-              <w:autoSpaceDN w:val="0"/>
-              <w:adjustRightInd w:val="0"/>
-              <w:jc w:val="center"/>
-              <w:rPr>
-                <w:rFonts w:ascii="Calibri" w:hAnsi="Calibri" w:cs="Calibri"/>
-                <w:color w:val="000000"/>
-                <w:szCs w:val="18"/>
-              </w:rPr>
-            </w:pPr>
-            <w:proofErr w:type="gramStart"/>
-            <w:r>
-              <w:rPr>
-                <w:rFonts w:ascii="Calibri" w:hAnsi="Calibri" w:cs="Calibri"/>
-                <w:color w:val="000000"/>
-                <w:szCs w:val="18"/>
-              </w:rPr>
-              <w:t xml:space="preserve">{{ </w:t>
-            </w:r>
-            <w:proofErr w:type="spellStart"/>
-            <w:r>
-              <w:rPr>
-                <w:rFonts w:ascii="Calibri" w:hAnsi="Calibri" w:cs="Calibri"/>
-                <w:color w:val="000000"/>
-                <w:szCs w:val="18"/>
-              </w:rPr>
-              <w:t>item</w:t>
-            </w:r>
-            <w:proofErr w:type="gramEnd"/>
-            <w:r>
-              <w:rPr>
-                <w:rFonts w:ascii="Calibri" w:hAnsi="Calibri" w:cs="Calibri"/>
-                <w:color w:val="000000"/>
-                <w:szCs w:val="18"/>
-              </w:rPr>
-              <w:t>.Puissance_Souscrite.quantite</w:t>
-            </w:r>
-            <w:proofErr w:type="spellEnd"/>
-            <w:r>
-              <w:rPr>
-                <w:rFonts w:ascii="Calibri" w:hAnsi="Calibri" w:cs="Calibri"/>
-                <w:color w:val="000000"/>
-                <w:szCs w:val="18"/>
-              </w:rPr>
-              <w:t xml:space="preserve"> }}</w:t>
+              <w:t>{% endfor %}</w:t>
             </w:r>
           </w:p>
         </w:tc>
@@ -2442,14 +2667,6 @@
         </w:rPr>
         <w:tab/>
       </w:r>
-      <w:r>
-        <w:rPr>
-          <w:rFonts w:ascii="Arial" w:hAnsi="Arial" w:cs="Arial"/>
-          <w:sz w:val="22"/>
-          <w:szCs w:val="22"/>
-        </w:rPr>
-        <w:t>{% endfor %}</w:t>
-      </w:r>
     </w:p>
     <w:p>
       <w:pPr>
@@ -2480,13 +2697,38 @@
           <w:szCs w:val="22"/>
         </w:rPr>
       </w:pPr>
-      <w:r>
-        <w:rPr>
-          <w:rFonts w:ascii="Arial" w:hAnsi="Arial" w:cs="Arial"/>
-          <w:sz w:val="22"/>
-          <w:szCs w:val="22"/>
-        </w:rPr>
-        <w:t>Suite aux données des factures analysées, une optimisation de cette puissance pourrait être recommandée.</w:t>
+    </w:p>
+    <w:p>
+      <w:pPr>
+        <w:autoSpaceDE w:val="0"/>
+        <w:autoSpaceDN w:val="0"/>
+        <w:adjustRightInd w:val="0"/>
+        <w:spacing w:line="360" w:lineRule="auto"/>
+        <w:ind w:left="567"/>
+        <w:jc w:val="both"/>
+        <w:rPr>
+          <w:rFonts w:ascii="Arial" w:hAnsi="Arial" w:cs="Arial"/>
+          <w:sz w:val="22"/>
+          <w:szCs w:val="22"/>
+        </w:rPr>
+      </w:pPr>
+      <w:proofErr w:type="gramStart"/>
+      <w:r>
+        <w:rPr>
+          <w:rFonts w:ascii="Arial" w:hAnsi="Arial" w:cs="Arial"/>
+          <w:sz w:val="22"/>
+          <w:szCs w:val="22"/>
+        </w:rPr>
+        <w:t>Suite aux</w:t>
+      </w:r>
+      <w:proofErr w:type="gramEnd"/>
+      <w:r>
+        <w:rPr>
+          <w:rFonts w:ascii="Arial" w:hAnsi="Arial" w:cs="Arial"/>
+          <w:sz w:val="22"/>
+          <w:szCs w:val="22"/>
+        </w:rPr>
+        <w:t xml:space="preserve"> données des factures analysées, une optimisation de cette puissance pourrait être recommandée.</w:t>
       </w:r>
     </w:p>
     <w:p>
@@ -2655,9 +2897,9 @@
         <w:tblLook w:val="04A0" w:firstRow="1" w:lastRow="0" w:firstColumn="1" w:lastColumn="0" w:noHBand="0" w:noVBand="1"/>
       </w:tblPr>
       <w:tblGrid>
-        <w:gridCol w:w="3471"/>
-        <w:gridCol w:w="2523"/>
-        <w:gridCol w:w="785"/>
+        <w:gridCol w:w="3357"/>
+        <w:gridCol w:w="2641"/>
+        <w:gridCol w:w="781"/>
       </w:tblGrid>
       <w:tr>
         <w:trPr>
@@ -2714,15 +2956,59 @@
                 <w:szCs w:val="18"/>
               </w:rPr>
             </w:pPr>
-            <w:r>
-              <w:rPr>
-                <w:rFonts w:ascii="Calibri" w:hAnsi="Calibri" w:cs="Calibri"/>
-                <w:b/>
-                <w:color w:val="000000"/>
+            <w:proofErr w:type="gramStart"/>
+            <w:r>
+              <w:rPr>
+                <w:rFonts w:ascii="Arial" w:hAnsi="Arial" w:cs="Arial"/>
                 <w:sz w:val="22"/>
-                <w:szCs w:val="18"/>
-              </w:rPr>
-              <w:t>Avril 2021 à Mars 2022</w:t>
+                <w:szCs w:val="22"/>
+              </w:rPr>
+              <w:t>{{ data</w:t>
+            </w:r>
+            <w:proofErr w:type="gramEnd"/>
+            <w:r>
+              <w:rPr>
+                <w:rFonts w:ascii="Arial" w:hAnsi="Arial" w:cs="Arial"/>
+                <w:sz w:val="22"/>
+                <w:szCs w:val="22"/>
+              </w:rPr>
+              <w:t>[0].</w:t>
+            </w:r>
+            <w:proofErr w:type="spellStart"/>
+            <w:r>
+              <w:rPr>
+                <w:rFonts w:ascii="Arial" w:hAnsi="Arial" w:cs="Arial"/>
+                <w:sz w:val="22"/>
+                <w:szCs w:val="22"/>
+              </w:rPr>
+              <w:t>Mois_de_Consomation</w:t>
+            </w:r>
+            <w:proofErr w:type="spellEnd"/>
+            <w:r>
+              <w:rPr>
+                <w:rFonts w:ascii="Arial" w:hAnsi="Arial" w:cs="Arial"/>
+                <w:sz w:val="22"/>
+                <w:szCs w:val="22"/>
+              </w:rPr>
+              <w:t>}} à {{ data[-1].</w:t>
+            </w:r>
+            <w:proofErr w:type="spellStart"/>
+            <w:r>
+              <w:rPr>
+                <w:rFonts w:ascii="Arial" w:hAnsi="Arial" w:cs="Arial"/>
+                <w:sz w:val="22"/>
+                <w:szCs w:val="22"/>
+              </w:rPr>
+              <w:t>Mois_de_Consomation</w:t>
+            </w:r>
+            <w:proofErr w:type="spellEnd"/>
+            <w:r>
+              <w:rPr>
+                <w:rFonts w:ascii="Arial" w:hAnsi="Arial" w:cs="Arial"/>
+                <w:sz w:val="22"/>
+                <w:szCs w:val="22"/>
+              </w:rPr>
+              <w:t>}}</w:t>
             </w:r>
           </w:p>
         </w:tc>
@@ -3869,10 +4155,10 @@
         <w:tblLook w:val="04A0" w:firstRow="1" w:lastRow="0" w:firstColumn="1" w:lastColumn="0" w:noHBand="0" w:noVBand="1"/>
       </w:tblPr>
       <w:tblGrid>
-        <w:gridCol w:w="4346"/>
-        <w:gridCol w:w="2505"/>
-        <w:gridCol w:w="840"/>
-        <w:gridCol w:w="840"/>
+        <w:gridCol w:w="3598"/>
+        <w:gridCol w:w="3348"/>
+        <w:gridCol w:w="790"/>
+        <w:gridCol w:w="795"/>
       </w:tblGrid>
       <w:tr>
         <w:trPr>
@@ -3928,15 +4214,59 @@
                 <w:szCs w:val="18"/>
               </w:rPr>
             </w:pPr>
-            <w:r>
-              <w:rPr>
-                <w:rFonts w:ascii="Calibri" w:hAnsi="Calibri" w:cs="Calibri"/>
-                <w:b/>
-                <w:color w:val="000000"/>
+            <w:proofErr w:type="gramStart"/>
+            <w:r>
+              <w:rPr>
+                <w:rFonts w:ascii="Arial" w:hAnsi="Arial" w:cs="Arial"/>
                 <w:sz w:val="22"/>
-                <w:szCs w:val="18"/>
-              </w:rPr>
-              <w:t>Avril 2021 à Mars 2022</w:t>
+                <w:szCs w:val="22"/>
+              </w:rPr>
+              <w:t>{{ data</w:t>
+            </w:r>
+            <w:proofErr w:type="gramEnd"/>
+            <w:r>
+              <w:rPr>
+                <w:rFonts w:ascii="Arial" w:hAnsi="Arial" w:cs="Arial"/>
+                <w:sz w:val="22"/>
+                <w:szCs w:val="22"/>
+              </w:rPr>
+              <w:t>[0].</w:t>
+            </w:r>
+            <w:proofErr w:type="spellStart"/>
+            <w:r>
+              <w:rPr>
+                <w:rFonts w:ascii="Arial" w:hAnsi="Arial" w:cs="Arial"/>
+                <w:sz w:val="22"/>
+                <w:szCs w:val="22"/>
+              </w:rPr>
+              <w:t>Mois_de_Consomation</w:t>
+            </w:r>
+            <w:proofErr w:type="spellEnd"/>
+            <w:r>
+              <w:rPr>
+                <w:rFonts w:ascii="Arial" w:hAnsi="Arial" w:cs="Arial"/>
+                <w:sz w:val="22"/>
+                <w:szCs w:val="22"/>
+              </w:rPr>
+              <w:t>}} à {{ data[-1].</w:t>
+            </w:r>
+            <w:proofErr w:type="spellStart"/>
+            <w:r>
+              <w:rPr>
+                <w:rFonts w:ascii="Arial" w:hAnsi="Arial" w:cs="Arial"/>
+                <w:sz w:val="22"/>
+                <w:szCs w:val="22"/>
+              </w:rPr>
+              <w:t>Mois_de_Consomation</w:t>
+            </w:r>
+            <w:proofErr w:type="spellEnd"/>
+            <w:r>
+              <w:rPr>
+                <w:rFonts w:ascii="Arial" w:hAnsi="Arial" w:cs="Arial"/>
+                <w:sz w:val="22"/>
+                <w:szCs w:val="22"/>
+              </w:rPr>
+              <w:t>}}</w:t>
             </w:r>
           </w:p>
         </w:tc>
@@ -4520,6 +4850,7 @@
                 <w:color w:val="808080"/>
                 <w:szCs w:val="18"/>
               </w:rPr>
+              <w:lastRenderedPageBreak/>
               <w:t>Mois Concerné</w:t>
             </w:r>
           </w:p>
@@ -4945,23 +5276,7 @@
           <w:sz w:val="22"/>
           <w:szCs w:val="22"/>
         </w:rPr>
-        <w:t>-1].</w:t>
-      </w:r>
-      <w:r>
-        <w:rPr>
-          <w:rFonts w:ascii="Arial" w:hAnsi="Arial" w:cs="Arial"/>
-          <w:sz w:val="22"/>
-          <w:szCs w:val="22"/>
-        </w:rPr>
-        <w:t xml:space="preserve">pie1 </w:t>
-      </w:r>
-      <w:r>
-        <w:rPr>
-          <w:rFonts w:ascii="Arial" w:hAnsi="Arial" w:cs="Arial"/>
-          <w:sz w:val="22"/>
-          <w:szCs w:val="22"/>
-        </w:rPr>
-        <w:t>}}</w:t>
+        <w:t>-1].pie1 }}</w:t>
       </w:r>
     </w:p>
     <w:p>
@@ -5400,70 +5715,93 @@
       <w:pPr>
         <w:spacing w:line="276" w:lineRule="auto"/>
         <w:ind w:left="142"/>
+        <w:rPr>
+          <w:rFonts w:ascii="Arial" w:hAnsi="Arial" w:cs="Arial"/>
+          <w:b/>
+        </w:rPr>
+      </w:pPr>
+    </w:p>
+    <w:p>
+      <w:pPr>
+        <w:spacing w:line="276" w:lineRule="auto"/>
+        <w:ind w:left="142"/>
+        <w:rPr>
+          <w:rFonts w:ascii="Arial" w:hAnsi="Arial" w:cs="Arial"/>
+          <w:b/>
+        </w:rPr>
+      </w:pPr>
+    </w:p>
+    <w:p>
+      <w:pPr>
+        <w:spacing w:line="276" w:lineRule="auto"/>
+        <w:ind w:left="142"/>
+        <w:rPr>
+          <w:rFonts w:ascii="Arial" w:hAnsi="Arial" w:cs="Arial"/>
+          <w:b/>
+        </w:rPr>
+      </w:pPr>
+    </w:p>
+    <w:p>
+      <w:pPr>
+        <w:spacing w:line="276" w:lineRule="auto"/>
+        <w:ind w:left="142"/>
+        <w:rPr>
+          <w:rFonts w:ascii="Arial" w:hAnsi="Arial" w:cs="Arial"/>
+          <w:b/>
+        </w:rPr>
+      </w:pPr>
+    </w:p>
+    <w:p>
+      <w:pPr>
+        <w:spacing w:line="276" w:lineRule="auto"/>
+        <w:ind w:left="142"/>
+        <w:rPr>
+          <w:rFonts w:ascii="Arial" w:hAnsi="Arial" w:cs="Arial"/>
+          <w:b/>
+        </w:rPr>
+      </w:pPr>
+      <w:proofErr w:type="gramStart"/>
+      <w:r>
+        <w:rPr>
+          <w:rFonts w:ascii="Arial" w:hAnsi="Arial" w:cs="Arial"/>
+          <w:b/>
+        </w:rPr>
+        <w:t>{{ data</w:t>
+      </w:r>
+      <w:proofErr w:type="gramEnd"/>
+      <w:r>
+        <w:rPr>
+          <w:rFonts w:ascii="Arial" w:hAnsi="Arial" w:cs="Arial"/>
+          <w:b/>
+        </w:rPr>
+        <w:t>[-1].</w:t>
+      </w:r>
+      <w:proofErr w:type="spellStart"/>
+      <w:r>
+        <w:rPr>
+          <w:rFonts w:ascii="Arial" w:hAnsi="Arial" w:cs="Arial"/>
+          <w:b/>
+        </w:rPr>
+        <w:t>cosPhiChart</w:t>
+      </w:r>
+      <w:proofErr w:type="spellEnd"/>
+      <w:r>
+        <w:rPr>
+          <w:rFonts w:ascii="Arial" w:hAnsi="Arial" w:cs="Arial"/>
+          <w:b/>
+        </w:rPr>
+        <w:t xml:space="preserve"> }}</w:t>
+      </w:r>
+    </w:p>
+    <w:p>
+      <w:pPr>
+        <w:spacing w:line="276" w:lineRule="auto"/>
+        <w:ind w:left="142"/>
         <w:jc w:val="center"/>
         <w:rPr>
           <w:noProof/>
         </w:rPr>
       </w:pPr>
-      <w:r>
-        <w:rPr>
-          <w:noProof/>
-        </w:rPr>
-        <w:lastRenderedPageBreak/>
-        <w:drawing>
-          <wp:inline distT="0" distB="0" distL="0" distR="0" wp14:anchorId="022BE230" wp14:editId="45DDA837">
-            <wp:extent cx="5505450" cy="2867025"/>
-            <wp:effectExtent l="0" t="38100" r="19050" b="0"/>
-            <wp:docPr id="1969949100" name="Picture 2" descr="A graph showing the growth of a company&#10;&#10;Description automatically generated"/>
-            <wp:cNvGraphicFramePr>
-              <a:graphicFrameLocks xmlns:a="http://schemas.openxmlformats.org/drawingml/2006/main" noChangeAspect="1"/>
-            </wp:cNvGraphicFramePr>
-            <a:graphic xmlns:a="http://schemas.openxmlformats.org/drawingml/2006/main">
-              <a:graphicData uri="http://schemas.openxmlformats.org/drawingml/2006/picture">
-                <pic:pic xmlns:pic="http://schemas.openxmlformats.org/drawingml/2006/picture">
-                  <pic:nvPicPr>
-                    <pic:cNvPr id="1969949100" name="Picture 2" descr="A graph showing the growth of a company&#10;&#10;Description automatically generated"/>
-                    <pic:cNvPicPr>
-                      <a:picLocks noChangeAspect="1" noChangeArrowheads="1"/>
-                    </pic:cNvPicPr>
-                  </pic:nvPicPr>
-                  <pic:blipFill>
-                    <a:blip r:embed="rId9">
-                      <a:extLst>
-                        <a:ext uri="{28A0092B-C50C-407E-A947-70E740481C1C}">
-                          <a14:useLocalDpi xmlns:a14="http://schemas.microsoft.com/office/drawing/2010/main" val="0"/>
-                        </a:ext>
-                      </a:extLst>
-                    </a:blip>
-                    <a:srcRect/>
-                    <a:stretch>
-                      <a:fillRect/>
-                    </a:stretch>
-                  </pic:blipFill>
-                  <pic:spPr bwMode="auto">
-                    <a:xfrm>
-                      <a:off x="0" y="0"/>
-                      <a:ext cx="5505450" cy="2867025"/>
-                    </a:xfrm>
-                    <a:prstGeom prst="rect">
-                      <a:avLst/>
-                    </a:prstGeom>
-                    <a:noFill/>
-                    <a:ln>
-                      <a:noFill/>
-                    </a:ln>
-                    <a:effectLst>
-                      <a:outerShdw dist="45791" dir="19578596" algn="ctr" rotWithShape="0">
-                        <a:srgbClr val="A29DAD"/>
-                      </a:outerShdw>
-                    </a:effectLst>
-                  </pic:spPr>
-                </pic:pic>
-              </a:graphicData>
-            </a:graphic>
-          </wp:inline>
-        </w:drawing>
-      </w:r>
     </w:p>
     <w:p>
       <w:pPr>
@@ -5496,6 +5834,7 @@
           <w:sz w:val="22"/>
           <w:szCs w:val="22"/>
         </w:rPr>
+        <w:lastRenderedPageBreak/>
         <w:t xml:space="preserve">Le facteur de puissance global de l’installation varie entre </w:t>
       </w:r>
       <w:r>
@@ -6145,7 +6484,7 @@
                     </pic:cNvPicPr>
                   </pic:nvPicPr>
                   <pic:blipFill>
-                    <a:blip r:embed="rId10">
+                    <a:blip r:embed="rId9">
                       <a:extLst>
                         <a:ext uri="{28A0092B-C50C-407E-A947-70E740481C1C}">
                           <a14:useLocalDpi xmlns:a14="http://schemas.microsoft.com/office/drawing/2010/main" val="0"/>
@@ -6214,6 +6553,7 @@
           <w:sz w:val="22"/>
           <w:szCs w:val="22"/>
         </w:rPr>
+        <w:lastRenderedPageBreak/>
         <w:t xml:space="preserve">D’après l’analyse des appels de puissance maximal (à CosPhi actuel) la puissance maximale atteinte (en KVA) étant de </w:t>
       </w:r>
       <w:r>
@@ -7010,8 +7350,8 @@
     </w:p>
     <w:p/>
     <w:sectPr>
-      <w:headerReference w:type="default" r:id="rId11"/>
-      <w:footerReference w:type="default" r:id="rId12"/>
+      <w:headerReference w:type="default" r:id="rId10"/>
+      <w:footerReference w:type="default" r:id="rId11"/>
       <w:pgSz w:w="11901" w:h="16841"/>
       <w:pgMar w:top="447" w:right="845" w:bottom="709" w:left="1276" w:header="425" w:footer="181" w:gutter="0"/>
       <w:cols w:space="60"/>
@@ -7261,7 +7601,7 @@
         <v:path o:extrusionok="f" gradientshapeok="t" o:connecttype="rect"/>
         <o:lock v:ext="edit" aspectratio="t"/>
       </v:shapetype>
-      <v:shape id="_x0000_i1154" type="#_x0000_t75" style="width:9.25pt;height:9.25pt" o:bullet="t">
+      <v:shape id="_x0000_i1099" type="#_x0000_t75" style="width:9.25pt;height:9.25pt" o:bullet="t">
         <v:imagedata r:id="rId1" o:title=""/>
       </v:shape>
     </w:pict>
@@ -8330,6 +8670,7 @@
   <w:style w:type="character" w:default="1" w:styleId="DefaultParagraphFont">
     <w:name w:val="Default Paragraph Font"/>
     <w:uiPriority w:val="1"/>
+    <w:semiHidden/>
     <w:unhideWhenUsed/>
   </w:style>
   <w:style w:type="table" w:default="1" w:styleId="TableNormal">

</xml_diff>

<commit_message>
finsihed most of the report
</commit_message>
<xml_diff>
--- a/template.docx
+++ b/template.docx
@@ -2897,9 +2897,9 @@
         <w:tblLook w:val="04A0" w:firstRow="1" w:lastRow="0" w:firstColumn="1" w:lastColumn="0" w:noHBand="0" w:noVBand="1"/>
       </w:tblPr>
       <w:tblGrid>
-        <w:gridCol w:w="3357"/>
-        <w:gridCol w:w="2641"/>
-        <w:gridCol w:w="781"/>
+        <w:gridCol w:w="3321"/>
+        <w:gridCol w:w="2682"/>
+        <w:gridCol w:w="776"/>
       </w:tblGrid>
       <w:tr>
         <w:trPr>
@@ -3370,16 +3370,7 @@
                 <w:color w:val="000000"/>
                 <w:szCs w:val="18"/>
               </w:rPr>
-              <w:t>8</w:t>
-            </w:r>
-            <w:r>
-              <w:rPr>
-                <w:rFonts w:ascii="Calibri" w:hAnsi="Calibri" w:cs="Calibri"/>
-                <w:b/>
-                <w:color w:val="000000"/>
-                <w:szCs w:val="18"/>
-              </w:rPr>
-              <w:t>9</w:t>
+              <w:t>..</w:t>
             </w:r>
             <w:r>
               <w:rPr>
@@ -3715,6 +3706,46 @@
                 <w:szCs w:val="18"/>
               </w:rPr>
             </w:pPr>
+            <w:r>
+              <w:rPr>
+                <w:rFonts w:ascii="Calibri" w:hAnsi="Calibri" w:cs="Calibri"/>
+                <w:b/>
+                <w:color w:val="000000"/>
+                <w:szCs w:val="18"/>
+              </w:rPr>
+              <w:t>{{data[-1</w:t>
+            </w:r>
+            <w:proofErr w:type="gramStart"/>
+            <w:r>
+              <w:rPr>
+                <w:rFonts w:ascii="Calibri" w:hAnsi="Calibri" w:cs="Calibri"/>
+                <w:b/>
+                <w:color w:val="000000"/>
+                <w:szCs w:val="18"/>
+              </w:rPr>
+              <w:t>].</w:t>
+            </w:r>
+            <w:proofErr w:type="spellStart"/>
+            <w:r>
+              <w:rPr>
+                <w:rFonts w:ascii="Calibri" w:hAnsi="Calibri" w:cs="Calibri"/>
+                <w:b/>
+                <w:color w:val="000000"/>
+                <w:szCs w:val="18"/>
+              </w:rPr>
+              <w:t>majCosPhi</w:t>
+            </w:r>
+            <w:proofErr w:type="spellEnd"/>
+            <w:proofErr w:type="gramEnd"/>
+            <w:r>
+              <w:rPr>
+                <w:rFonts w:ascii="Calibri" w:hAnsi="Calibri" w:cs="Calibri"/>
+                <w:b/>
+                <w:color w:val="000000"/>
+                <w:szCs w:val="18"/>
+              </w:rPr>
+              <w:t>}}</w:t>
+            </w:r>
           </w:p>
         </w:tc>
         <w:tc>
@@ -3971,7 +4002,7 @@
                     </pic:cNvPicPr>
                   </pic:nvPicPr>
                   <pic:blipFill>
-                    <a:blip r:embed="rId7" cstate="print">
+                    <a:blip r:embed="rId8" cstate="print">
                       <a:extLst>
                         <a:ext uri="{28A0092B-C50C-407E-A947-70E740481C1C}">
                           <a14:useLocalDpi xmlns:a14="http://schemas.microsoft.com/office/drawing/2010/main" val="0"/>
@@ -4024,7 +4055,7 @@
         </w:rPr>
         <w:t xml:space="preserve">( </w:t>
       </w:r>
-      <w:hyperlink r:id="rId8" w:history="1">
+      <w:hyperlink r:id="rId9" w:history="1">
         <w:r>
           <w:rPr>
             <w:rStyle w:val="Hyperlink"/>
@@ -4131,6 +4162,150 @@
     </w:p>
     <w:p>
       <w:pPr>
+        <w:shd w:val="clear" w:color="auto" w:fill="FFFFFF"/>
+        <w:tabs>
+          <w:tab w:val="left" w:pos="4249"/>
+          <w:tab w:val="left" w:pos="5824"/>
+        </w:tabs>
+        <w:rPr>
+          <w:rFonts w:ascii="Arial" w:hAnsi="Arial" w:cs="Arial"/>
+          <w:b/>
+          <w:bCs/>
+          <w:sz w:val="24"/>
+          <w:szCs w:val="24"/>
+        </w:rPr>
+      </w:pPr>
+    </w:p>
+    <w:p>
+      <w:pPr>
+        <w:shd w:val="clear" w:color="auto" w:fill="FFFFFF"/>
+        <w:tabs>
+          <w:tab w:val="left" w:pos="4249"/>
+          <w:tab w:val="left" w:pos="5824"/>
+        </w:tabs>
+        <w:rPr>
+          <w:rFonts w:ascii="Arial" w:hAnsi="Arial" w:cs="Arial"/>
+          <w:b/>
+          <w:bCs/>
+          <w:sz w:val="24"/>
+          <w:szCs w:val="24"/>
+        </w:rPr>
+      </w:pPr>
+    </w:p>
+    <w:p>
+      <w:pPr>
+        <w:shd w:val="clear" w:color="auto" w:fill="FFFFFF"/>
+        <w:tabs>
+          <w:tab w:val="left" w:pos="4249"/>
+          <w:tab w:val="left" w:pos="5824"/>
+        </w:tabs>
+        <w:rPr>
+          <w:rFonts w:ascii="Arial" w:hAnsi="Arial" w:cs="Arial"/>
+          <w:b/>
+          <w:bCs/>
+          <w:sz w:val="24"/>
+          <w:szCs w:val="24"/>
+        </w:rPr>
+      </w:pPr>
+    </w:p>
+    <w:p>
+      <w:pPr>
+        <w:shd w:val="clear" w:color="auto" w:fill="FFFFFF"/>
+        <w:tabs>
+          <w:tab w:val="left" w:pos="4249"/>
+          <w:tab w:val="left" w:pos="5824"/>
+        </w:tabs>
+        <w:rPr>
+          <w:rFonts w:ascii="Arial" w:hAnsi="Arial" w:cs="Arial"/>
+          <w:b/>
+          <w:bCs/>
+          <w:sz w:val="24"/>
+          <w:szCs w:val="24"/>
+        </w:rPr>
+      </w:pPr>
+    </w:p>
+    <w:p>
+      <w:pPr>
+        <w:shd w:val="clear" w:color="auto" w:fill="FFFFFF"/>
+        <w:tabs>
+          <w:tab w:val="left" w:pos="4249"/>
+          <w:tab w:val="left" w:pos="5824"/>
+        </w:tabs>
+        <w:rPr>
+          <w:rFonts w:ascii="Arial" w:hAnsi="Arial" w:cs="Arial"/>
+          <w:b/>
+          <w:bCs/>
+          <w:sz w:val="24"/>
+          <w:szCs w:val="24"/>
+        </w:rPr>
+      </w:pPr>
+    </w:p>
+    <w:p>
+      <w:pPr>
+        <w:shd w:val="clear" w:color="auto" w:fill="FFFFFF"/>
+        <w:tabs>
+          <w:tab w:val="left" w:pos="4249"/>
+          <w:tab w:val="left" w:pos="5824"/>
+        </w:tabs>
+        <w:rPr>
+          <w:rFonts w:ascii="Arial" w:hAnsi="Arial" w:cs="Arial"/>
+          <w:b/>
+          <w:bCs/>
+          <w:sz w:val="24"/>
+          <w:szCs w:val="24"/>
+        </w:rPr>
+      </w:pPr>
+    </w:p>
+    <w:p>
+      <w:pPr>
+        <w:shd w:val="clear" w:color="auto" w:fill="FFFFFF"/>
+        <w:tabs>
+          <w:tab w:val="left" w:pos="4249"/>
+          <w:tab w:val="left" w:pos="5824"/>
+        </w:tabs>
+        <w:rPr>
+          <w:rFonts w:ascii="Arial" w:hAnsi="Arial" w:cs="Arial"/>
+          <w:b/>
+          <w:bCs/>
+          <w:sz w:val="24"/>
+          <w:szCs w:val="24"/>
+        </w:rPr>
+      </w:pPr>
+    </w:p>
+    <w:p>
+      <w:pPr>
+        <w:shd w:val="clear" w:color="auto" w:fill="FFFFFF"/>
+        <w:tabs>
+          <w:tab w:val="left" w:pos="4249"/>
+          <w:tab w:val="left" w:pos="5824"/>
+        </w:tabs>
+        <w:rPr>
+          <w:rFonts w:ascii="Arial" w:hAnsi="Arial" w:cs="Arial"/>
+          <w:b/>
+          <w:bCs/>
+          <w:sz w:val="24"/>
+          <w:szCs w:val="24"/>
+        </w:rPr>
+      </w:pPr>
+    </w:p>
+    <w:p>
+      <w:pPr>
+        <w:shd w:val="clear" w:color="auto" w:fill="FFFFFF"/>
+        <w:tabs>
+          <w:tab w:val="left" w:pos="4249"/>
+          <w:tab w:val="left" w:pos="5824"/>
+        </w:tabs>
+        <w:rPr>
+          <w:rFonts w:ascii="Arial" w:hAnsi="Arial" w:cs="Arial"/>
+          <w:b/>
+          <w:bCs/>
+          <w:sz w:val="24"/>
+          <w:szCs w:val="24"/>
+        </w:rPr>
+      </w:pPr>
+    </w:p>
+    <w:p>
+      <w:pPr>
         <w:spacing w:line="276" w:lineRule="auto"/>
         <w:ind w:left="142"/>
         <w:rPr>
@@ -4142,7 +4317,7 @@
     </w:p>
     <w:tbl>
       <w:tblPr>
-        <w:tblW w:w="8531" w:type="dxa"/>
+        <w:tblW w:w="9996" w:type="dxa"/>
         <w:jc w:val="center"/>
         <w:tblBorders>
           <w:top w:val="single" w:sz="4" w:space="0" w:color="auto"/>
@@ -4155,10 +4330,10 @@
         <w:tblLook w:val="04A0" w:firstRow="1" w:lastRow="0" w:firstColumn="1" w:lastColumn="0" w:noHBand="0" w:noVBand="1"/>
       </w:tblPr>
       <w:tblGrid>
-        <w:gridCol w:w="3598"/>
-        <w:gridCol w:w="3348"/>
-        <w:gridCol w:w="790"/>
-        <w:gridCol w:w="795"/>
+        <w:gridCol w:w="1423"/>
+        <w:gridCol w:w="4213"/>
+        <w:gridCol w:w="2163"/>
+        <w:gridCol w:w="2197"/>
       </w:tblGrid>
       <w:tr>
         <w:trPr>
@@ -4167,7 +4342,7 @@
         </w:trPr>
         <w:tc>
           <w:tcPr>
-            <w:tcW w:w="4346" w:type="dxa"/>
+            <w:tcW w:w="2088" w:type="dxa"/>
             <w:tcBorders>
               <w:top w:val="nil"/>
               <w:left w:val="nil"/>
@@ -4193,7 +4368,7 @@
         </w:tc>
         <w:tc>
           <w:tcPr>
-            <w:tcW w:w="2505" w:type="dxa"/>
+            <w:tcW w:w="3548" w:type="dxa"/>
             <w:tcBorders>
               <w:left w:val="single" w:sz="4" w:space="0" w:color="auto"/>
             </w:tcBorders>
@@ -4272,7 +4447,7 @@
         </w:tc>
         <w:tc>
           <w:tcPr>
-            <w:tcW w:w="840" w:type="dxa"/>
+            <w:tcW w:w="2163" w:type="dxa"/>
             <w:tcBorders>
               <w:left w:val="single" w:sz="4" w:space="0" w:color="auto"/>
             </w:tcBorders>
@@ -4311,7 +4486,7 @@
         </w:tc>
         <w:tc>
           <w:tcPr>
-            <w:tcW w:w="840" w:type="dxa"/>
+            <w:tcW w:w="2197" w:type="dxa"/>
             <w:tcBorders>
               <w:left w:val="single" w:sz="4" w:space="0" w:color="auto"/>
             </w:tcBorders>
@@ -4356,7 +4531,7 @@
         </w:trPr>
         <w:tc>
           <w:tcPr>
-            <w:tcW w:w="4346" w:type="dxa"/>
+            <w:tcW w:w="2088" w:type="dxa"/>
             <w:tcBorders>
               <w:top w:val="single" w:sz="4" w:space="0" w:color="auto"/>
             </w:tcBorders>
@@ -4395,7 +4570,7 @@
         </w:tc>
         <w:tc>
           <w:tcPr>
-            <w:tcW w:w="2505" w:type="dxa"/>
+            <w:tcW w:w="3548" w:type="dxa"/>
             <w:shd w:val="clear" w:color="auto" w:fill="E2EFD9"/>
             <w:vAlign w:val="center"/>
           </w:tcPr>
@@ -4419,22 +4594,62 @@
                 <w:color w:val="000000"/>
                 <w:szCs w:val="18"/>
               </w:rPr>
-              <w:t>1,1</w:t>
-            </w:r>
-            <w:r>
-              <w:rPr>
-                <w:rFonts w:ascii="Calibri" w:hAnsi="Calibri" w:cs="Calibri"/>
-                <w:b/>
-                <w:color w:val="000000"/>
-                <w:szCs w:val="18"/>
-              </w:rPr>
-              <w:t>3</w:t>
+              <w:t>{{</w:t>
+            </w:r>
+            <w:proofErr w:type="gramStart"/>
+            <w:r>
+              <w:rPr>
+                <w:rFonts w:ascii="Calibri" w:hAnsi="Calibri" w:cs="Calibri"/>
+                <w:b/>
+                <w:color w:val="000000"/>
+                <w:szCs w:val="18"/>
+              </w:rPr>
+              <w:t>data[</w:t>
+            </w:r>
+            <w:proofErr w:type="gramEnd"/>
+            <w:r>
+              <w:rPr>
+                <w:rFonts w:ascii="Calibri" w:hAnsi="Calibri" w:cs="Calibri"/>
+                <w:b/>
+                <w:color w:val="000000"/>
+                <w:szCs w:val="18"/>
+              </w:rPr>
+              <w:t>-1].</w:t>
+            </w:r>
+            <w:proofErr w:type="spellStart"/>
+            <w:r>
+              <w:rPr>
+                <w:rFonts w:ascii="Calibri" w:hAnsi="Calibri" w:cs="Calibri"/>
+                <w:b/>
+                <w:color w:val="000000"/>
+                <w:szCs w:val="18"/>
+              </w:rPr>
+              <w:t>total_prix_moy_TTC</w:t>
+            </w:r>
+            <w:proofErr w:type="spellEnd"/>
+            <w:r>
+              <w:rPr>
+                <w:rFonts w:ascii="Calibri" w:hAnsi="Calibri" w:cs="Calibri"/>
+                <w:b/>
+                <w:color w:val="000000"/>
+                <w:szCs w:val="18"/>
+              </w:rPr>
+              <w:t xml:space="preserve"> </w:t>
+            </w:r>
+            <w:r>
+              <w:rPr>
+                <w:rFonts w:ascii="Calibri" w:hAnsi="Calibri" w:cs="Calibri"/>
+                <w:b/>
+                <w:color w:val="000000"/>
+                <w:szCs w:val="18"/>
+              </w:rPr>
+              <w:t>}}</w:t>
             </w:r>
           </w:p>
         </w:tc>
         <w:tc>
           <w:tcPr>
-            <w:tcW w:w="840" w:type="dxa"/>
+            <w:tcW w:w="2163" w:type="dxa"/>
             <w:shd w:val="clear" w:color="auto" w:fill="FFFFFF"/>
             <w:vAlign w:val="center"/>
           </w:tcPr>
@@ -4457,18 +4672,65 @@
               <w:rPr>
                 <w:rFonts w:ascii="Calibri" w:hAnsi="Calibri" w:cs="Calibri"/>
                 <w:b/>
-                <w:i/>
-                <w:iCs/>
-                <w:color w:val="808080"/>
-                <w:szCs w:val="18"/>
-              </w:rPr>
-              <w:t>1,08</w:t>
+                <w:color w:val="000000"/>
+                <w:szCs w:val="18"/>
+              </w:rPr>
+              <w:t>{{data[-1</w:t>
+            </w:r>
+            <w:proofErr w:type="gramStart"/>
+            <w:r>
+              <w:rPr>
+                <w:rFonts w:ascii="Calibri" w:hAnsi="Calibri" w:cs="Calibri"/>
+                <w:b/>
+                <w:color w:val="000000"/>
+                <w:szCs w:val="18"/>
+              </w:rPr>
+              <w:t>].</w:t>
+            </w:r>
+            <w:proofErr w:type="spellStart"/>
+            <w:r>
+              <w:rPr>
+                <w:rFonts w:ascii="Calibri" w:hAnsi="Calibri" w:cs="Calibri"/>
+                <w:b/>
+                <w:color w:val="000000"/>
+                <w:szCs w:val="18"/>
+              </w:rPr>
+              <w:t>min</w:t>
+            </w:r>
+            <w:proofErr w:type="gramEnd"/>
+            <w:r>
+              <w:rPr>
+                <w:rFonts w:ascii="Calibri" w:hAnsi="Calibri" w:cs="Calibri"/>
+                <w:b/>
+                <w:color w:val="000000"/>
+                <w:szCs w:val="18"/>
+              </w:rPr>
+              <w:t>_prix_moy_</w:t>
+            </w:r>
+            <w:r>
+              <w:rPr>
+                <w:rFonts w:ascii="Calibri" w:hAnsi="Calibri" w:cs="Calibri"/>
+                <w:b/>
+                <w:color w:val="000000"/>
+                <w:szCs w:val="18"/>
+              </w:rPr>
+              <w:t>TTC</w:t>
+            </w:r>
+            <w:proofErr w:type="spellEnd"/>
+            <w:r>
+              <w:rPr>
+                <w:rFonts w:ascii="Calibri" w:hAnsi="Calibri" w:cs="Calibri"/>
+                <w:b/>
+                <w:color w:val="000000"/>
+                <w:szCs w:val="18"/>
+              </w:rPr>
+              <w:t>}}</w:t>
             </w:r>
           </w:p>
         </w:tc>
         <w:tc>
           <w:tcPr>
-            <w:tcW w:w="840" w:type="dxa"/>
+            <w:tcW w:w="2197" w:type="dxa"/>
             <w:shd w:val="clear" w:color="auto" w:fill="FFFFFF"/>
             <w:vAlign w:val="center"/>
           </w:tcPr>
@@ -4491,12 +4753,48 @@
               <w:rPr>
                 <w:rFonts w:ascii="Calibri" w:hAnsi="Calibri" w:cs="Calibri"/>
                 <w:b/>
-                <w:i/>
-                <w:iCs/>
-                <w:color w:val="808080"/>
-                <w:szCs w:val="18"/>
-              </w:rPr>
-              <w:t>1,23</w:t>
+                <w:color w:val="000000"/>
+                <w:szCs w:val="18"/>
+              </w:rPr>
+              <w:t>{{data[-1].</w:t>
+            </w:r>
+            <w:proofErr w:type="spellStart"/>
+            <w:r>
+              <w:rPr>
+                <w:rFonts w:ascii="Calibri" w:hAnsi="Calibri" w:cs="Calibri"/>
+                <w:b/>
+                <w:color w:val="000000"/>
+                <w:szCs w:val="18"/>
+              </w:rPr>
+              <w:t>max</w:t>
+            </w:r>
+            <w:r>
+              <w:rPr>
+                <w:rFonts w:ascii="Calibri" w:hAnsi="Calibri" w:cs="Calibri"/>
+                <w:b/>
+                <w:color w:val="000000"/>
+                <w:szCs w:val="18"/>
+              </w:rPr>
+              <w:t>_prix_moy_</w:t>
+            </w:r>
+            <w:r>
+              <w:rPr>
+                <w:rFonts w:ascii="Calibri" w:hAnsi="Calibri" w:cs="Calibri"/>
+                <w:b/>
+                <w:color w:val="000000"/>
+                <w:szCs w:val="18"/>
+              </w:rPr>
+              <w:t>TTC</w:t>
+            </w:r>
+            <w:proofErr w:type="spellEnd"/>
+            <w:r>
+              <w:rPr>
+                <w:rFonts w:ascii="Calibri" w:hAnsi="Calibri" w:cs="Calibri"/>
+                <w:b/>
+                <w:color w:val="000000"/>
+                <w:szCs w:val="18"/>
+              </w:rPr>
+              <w:t>}}</w:t>
             </w:r>
           </w:p>
         </w:tc>
@@ -4508,7 +4806,7 @@
         </w:trPr>
         <w:tc>
           <w:tcPr>
-            <w:tcW w:w="4346" w:type="dxa"/>
+            <w:tcW w:w="2088" w:type="dxa"/>
             <w:shd w:val="clear" w:color="auto" w:fill="F2F2F2"/>
             <w:vAlign w:val="center"/>
           </w:tcPr>
@@ -4544,7 +4842,7 @@
         </w:tc>
         <w:tc>
           <w:tcPr>
-            <w:tcW w:w="2505" w:type="dxa"/>
+            <w:tcW w:w="3548" w:type="dxa"/>
             <w:shd w:val="clear" w:color="auto" w:fill="E2EFD9"/>
             <w:vAlign w:val="center"/>
           </w:tcPr>
@@ -4568,22 +4866,62 @@
                 <w:color w:val="000000"/>
                 <w:szCs w:val="18"/>
               </w:rPr>
-              <w:t>0,9</w:t>
-            </w:r>
-            <w:r>
-              <w:rPr>
-                <w:rFonts w:ascii="Calibri" w:hAnsi="Calibri" w:cs="Calibri"/>
-                <w:b/>
-                <w:color w:val="000000"/>
-                <w:szCs w:val="18"/>
-              </w:rPr>
-              <w:t>9</w:t>
+              <w:t>{{data[-1</w:t>
+            </w:r>
+            <w:proofErr w:type="gramStart"/>
+            <w:r>
+              <w:rPr>
+                <w:rFonts w:ascii="Calibri" w:hAnsi="Calibri" w:cs="Calibri"/>
+                <w:b/>
+                <w:color w:val="000000"/>
+                <w:szCs w:val="18"/>
+              </w:rPr>
+              <w:t>].</w:t>
+            </w:r>
+            <w:proofErr w:type="spellStart"/>
+            <w:r>
+              <w:rPr>
+                <w:rFonts w:ascii="Calibri" w:hAnsi="Calibri" w:cs="Calibri"/>
+                <w:b/>
+                <w:color w:val="000000"/>
+                <w:szCs w:val="18"/>
+              </w:rPr>
+              <w:t>total</w:t>
+            </w:r>
+            <w:proofErr w:type="gramEnd"/>
+            <w:r>
+              <w:rPr>
+                <w:rFonts w:ascii="Calibri" w:hAnsi="Calibri" w:cs="Calibri"/>
+                <w:b/>
+                <w:color w:val="000000"/>
+                <w:szCs w:val="18"/>
+              </w:rPr>
+              <w:t>_prix_moy_</w:t>
+            </w:r>
+            <w:r>
+              <w:rPr>
+                <w:rFonts w:ascii="Calibri" w:hAnsi="Calibri" w:cs="Calibri"/>
+                <w:b/>
+                <w:color w:val="000000"/>
+                <w:szCs w:val="18"/>
+              </w:rPr>
+              <w:t>HT</w:t>
+            </w:r>
+            <w:proofErr w:type="spellEnd"/>
+            <w:r>
+              <w:rPr>
+                <w:rFonts w:ascii="Calibri" w:hAnsi="Calibri" w:cs="Calibri"/>
+                <w:b/>
+                <w:color w:val="000000"/>
+                <w:szCs w:val="18"/>
+              </w:rPr>
+              <w:t>}}</w:t>
             </w:r>
           </w:p>
         </w:tc>
         <w:tc>
           <w:tcPr>
-            <w:tcW w:w="840" w:type="dxa"/>
+            <w:tcW w:w="2163" w:type="dxa"/>
             <w:shd w:val="clear" w:color="auto" w:fill="FFFFFF"/>
             <w:vAlign w:val="center"/>
           </w:tcPr>
@@ -4606,18 +4944,56 @@
               <w:rPr>
                 <w:rFonts w:ascii="Calibri" w:hAnsi="Calibri" w:cs="Calibri"/>
                 <w:b/>
-                <w:i/>
-                <w:iCs/>
-                <w:color w:val="808080"/>
-                <w:szCs w:val="18"/>
-              </w:rPr>
-              <w:t xml:space="preserve">0,94 </w:t>
+                <w:color w:val="000000"/>
+                <w:szCs w:val="18"/>
+              </w:rPr>
+              <w:t>{{data[-1</w:t>
+            </w:r>
+            <w:proofErr w:type="gramStart"/>
+            <w:r>
+              <w:rPr>
+                <w:rFonts w:ascii="Calibri" w:hAnsi="Calibri" w:cs="Calibri"/>
+                <w:b/>
+                <w:color w:val="000000"/>
+                <w:szCs w:val="18"/>
+              </w:rPr>
+              <w:t>].</w:t>
+            </w:r>
+            <w:proofErr w:type="spellStart"/>
+            <w:r>
+              <w:rPr>
+                <w:rFonts w:ascii="Calibri" w:hAnsi="Calibri" w:cs="Calibri"/>
+                <w:b/>
+                <w:color w:val="000000"/>
+                <w:szCs w:val="18"/>
+              </w:rPr>
+              <w:t>min</w:t>
+            </w:r>
+            <w:proofErr w:type="gramEnd"/>
+            <w:r>
+              <w:rPr>
+                <w:rFonts w:ascii="Calibri" w:hAnsi="Calibri" w:cs="Calibri"/>
+                <w:b/>
+                <w:color w:val="000000"/>
+                <w:szCs w:val="18"/>
+              </w:rPr>
+              <w:t>_prix_moy_HT</w:t>
+            </w:r>
+            <w:proofErr w:type="spellEnd"/>
+            <w:r>
+              <w:rPr>
+                <w:rFonts w:ascii="Calibri" w:hAnsi="Calibri" w:cs="Calibri"/>
+                <w:b/>
+                <w:color w:val="000000"/>
+                <w:szCs w:val="18"/>
+              </w:rPr>
+              <w:t>}}</w:t>
             </w:r>
           </w:p>
         </w:tc>
         <w:tc>
           <w:tcPr>
-            <w:tcW w:w="840" w:type="dxa"/>
+            <w:tcW w:w="2197" w:type="dxa"/>
             <w:shd w:val="clear" w:color="auto" w:fill="FFFFFF"/>
             <w:vAlign w:val="center"/>
           </w:tcPr>
@@ -4640,12 +5016,39 @@
               <w:rPr>
                 <w:rFonts w:ascii="Calibri" w:hAnsi="Calibri" w:cs="Calibri"/>
                 <w:b/>
-                <w:i/>
-                <w:iCs/>
-                <w:color w:val="808080"/>
-                <w:szCs w:val="18"/>
-              </w:rPr>
-              <w:t>1,01</w:t>
+                <w:color w:val="000000"/>
+                <w:szCs w:val="18"/>
+              </w:rPr>
+              <w:t>{{data[-1].</w:t>
+            </w:r>
+            <w:proofErr w:type="spellStart"/>
+            <w:r>
+              <w:rPr>
+                <w:rFonts w:ascii="Calibri" w:hAnsi="Calibri" w:cs="Calibri"/>
+                <w:b/>
+                <w:color w:val="000000"/>
+                <w:szCs w:val="18"/>
+              </w:rPr>
+              <w:t>max</w:t>
+            </w:r>
+            <w:r>
+              <w:rPr>
+                <w:rFonts w:ascii="Calibri" w:hAnsi="Calibri" w:cs="Calibri"/>
+                <w:b/>
+                <w:color w:val="000000"/>
+                <w:szCs w:val="18"/>
+              </w:rPr>
+              <w:t>_prix_moy_HT</w:t>
+            </w:r>
+            <w:proofErr w:type="spellEnd"/>
+            <w:r>
+              <w:rPr>
+                <w:rFonts w:ascii="Calibri" w:hAnsi="Calibri" w:cs="Calibri"/>
+                <w:b/>
+                <w:color w:val="000000"/>
+                <w:szCs w:val="18"/>
+              </w:rPr>
+              <w:t>}}</w:t>
             </w:r>
           </w:p>
         </w:tc>
@@ -4657,7 +5060,7 @@
         </w:trPr>
         <w:tc>
           <w:tcPr>
-            <w:tcW w:w="4346" w:type="dxa"/>
+            <w:tcW w:w="2088" w:type="dxa"/>
             <w:shd w:val="clear" w:color="auto" w:fill="F2F2F2"/>
             <w:vAlign w:val="center"/>
           </w:tcPr>
@@ -4717,7 +5120,7 @@
         </w:tc>
         <w:tc>
           <w:tcPr>
-            <w:tcW w:w="2505" w:type="dxa"/>
+            <w:tcW w:w="3548" w:type="dxa"/>
             <w:shd w:val="clear" w:color="auto" w:fill="E2EFD9"/>
             <w:vAlign w:val="center"/>
           </w:tcPr>
@@ -4741,13 +5144,53 @@
                 <w:color w:val="000000"/>
                 <w:szCs w:val="18"/>
               </w:rPr>
-              <w:t>0,88</w:t>
+              <w:t>{{data[-1</w:t>
+            </w:r>
+            <w:proofErr w:type="gramStart"/>
+            <w:r>
+              <w:rPr>
+                <w:rFonts w:ascii="Calibri" w:hAnsi="Calibri" w:cs="Calibri"/>
+                <w:b/>
+                <w:color w:val="000000"/>
+                <w:szCs w:val="18"/>
+              </w:rPr>
+              <w:t>].</w:t>
+            </w:r>
+            <w:proofErr w:type="spellStart"/>
+            <w:r>
+              <w:rPr>
+                <w:rFonts w:ascii="Calibri" w:hAnsi="Calibri" w:cs="Calibri"/>
+                <w:b/>
+                <w:color w:val="000000"/>
+                <w:szCs w:val="18"/>
+              </w:rPr>
+              <w:t>prix</w:t>
+            </w:r>
+            <w:proofErr w:type="gramEnd"/>
+            <w:r>
+              <w:rPr>
+                <w:rFonts w:ascii="Calibri" w:hAnsi="Calibri" w:cs="Calibri"/>
+                <w:b/>
+                <w:color w:val="000000"/>
+                <w:szCs w:val="18"/>
+              </w:rPr>
+              <w:t>_moy_KWH_consommation_seule_total</w:t>
+            </w:r>
+            <w:proofErr w:type="spellEnd"/>
+            <w:r>
+              <w:rPr>
+                <w:rFonts w:ascii="Calibri" w:hAnsi="Calibri" w:cs="Calibri"/>
+                <w:b/>
+                <w:color w:val="000000"/>
+                <w:szCs w:val="18"/>
+              </w:rPr>
+              <w:t>}}</w:t>
             </w:r>
           </w:p>
         </w:tc>
         <w:tc>
           <w:tcPr>
-            <w:tcW w:w="840" w:type="dxa"/>
+            <w:tcW w:w="2163" w:type="dxa"/>
             <w:shd w:val="clear" w:color="auto" w:fill="FFFFFF"/>
             <w:vAlign w:val="center"/>
           </w:tcPr>
@@ -4770,18 +5213,56 @@
               <w:rPr>
                 <w:rFonts w:ascii="Calibri" w:hAnsi="Calibri" w:cs="Calibri"/>
                 <w:b/>
-                <w:i/>
-                <w:iCs/>
-                <w:color w:val="808080"/>
-                <w:szCs w:val="18"/>
-              </w:rPr>
-              <w:t xml:space="preserve">0,77 </w:t>
+                <w:color w:val="000000"/>
+                <w:szCs w:val="18"/>
+              </w:rPr>
+              <w:t>{{data[-1</w:t>
+            </w:r>
+            <w:proofErr w:type="gramStart"/>
+            <w:r>
+              <w:rPr>
+                <w:rFonts w:ascii="Calibri" w:hAnsi="Calibri" w:cs="Calibri"/>
+                <w:b/>
+                <w:color w:val="000000"/>
+                <w:szCs w:val="18"/>
+              </w:rPr>
+              <w:t>].</w:t>
+            </w:r>
+            <w:proofErr w:type="spellStart"/>
+            <w:r>
+              <w:rPr>
+                <w:rFonts w:ascii="Calibri" w:hAnsi="Calibri" w:cs="Calibri"/>
+                <w:b/>
+                <w:color w:val="000000"/>
+                <w:szCs w:val="18"/>
+              </w:rPr>
+              <w:t>prix</w:t>
+            </w:r>
+            <w:proofErr w:type="gramEnd"/>
+            <w:r>
+              <w:rPr>
+                <w:rFonts w:ascii="Calibri" w:hAnsi="Calibri" w:cs="Calibri"/>
+                <w:b/>
+                <w:color w:val="000000"/>
+                <w:szCs w:val="18"/>
+              </w:rPr>
+              <w:t>_moy_min</w:t>
+            </w:r>
+            <w:proofErr w:type="spellEnd"/>
+            <w:r>
+              <w:rPr>
+                <w:rFonts w:ascii="Calibri" w:hAnsi="Calibri" w:cs="Calibri"/>
+                <w:b/>
+                <w:color w:val="000000"/>
+                <w:szCs w:val="18"/>
+              </w:rPr>
+              <w:t>}}</w:t>
             </w:r>
           </w:p>
         </w:tc>
         <w:tc>
           <w:tcPr>
-            <w:tcW w:w="840" w:type="dxa"/>
+            <w:tcW w:w="2197" w:type="dxa"/>
             <w:shd w:val="clear" w:color="auto" w:fill="FFFFFF"/>
             <w:vAlign w:val="center"/>
           </w:tcPr>
@@ -4804,12 +5285,59 @@
               <w:rPr>
                 <w:rFonts w:ascii="Calibri" w:hAnsi="Calibri" w:cs="Calibri"/>
                 <w:b/>
-                <w:i/>
-                <w:iCs/>
-                <w:color w:val="808080"/>
-                <w:szCs w:val="18"/>
-              </w:rPr>
-              <w:t>0,83</w:t>
+                <w:color w:val="000000"/>
+                <w:szCs w:val="18"/>
+              </w:rPr>
+              <w:t>{{data[-1</w:t>
+            </w:r>
+            <w:proofErr w:type="gramStart"/>
+            <w:r>
+              <w:rPr>
+                <w:rFonts w:ascii="Calibri" w:hAnsi="Calibri" w:cs="Calibri"/>
+                <w:b/>
+                <w:color w:val="000000"/>
+                <w:szCs w:val="18"/>
+              </w:rPr>
+              <w:t>].</w:t>
+            </w:r>
+            <w:proofErr w:type="spellStart"/>
+            <w:r>
+              <w:rPr>
+                <w:rFonts w:ascii="Calibri" w:hAnsi="Calibri" w:cs="Calibri"/>
+                <w:b/>
+                <w:color w:val="000000"/>
+                <w:szCs w:val="18"/>
+              </w:rPr>
+              <w:t>prix</w:t>
+            </w:r>
+            <w:proofErr w:type="gramEnd"/>
+            <w:r>
+              <w:rPr>
+                <w:rFonts w:ascii="Calibri" w:hAnsi="Calibri" w:cs="Calibri"/>
+                <w:b/>
+                <w:color w:val="000000"/>
+                <w:szCs w:val="18"/>
+              </w:rPr>
+              <w:t>_moy_</w:t>
+            </w:r>
+            <w:r>
+              <w:rPr>
+                <w:rFonts w:ascii="Calibri" w:hAnsi="Calibri" w:cs="Calibri"/>
+                <w:b/>
+                <w:color w:val="000000"/>
+                <w:szCs w:val="18"/>
+              </w:rPr>
+              <w:t>max</w:t>
+            </w:r>
+            <w:proofErr w:type="spellEnd"/>
+            <w:r>
+              <w:rPr>
+                <w:rFonts w:ascii="Calibri" w:hAnsi="Calibri" w:cs="Calibri"/>
+                <w:b/>
+                <w:color w:val="000000"/>
+                <w:szCs w:val="18"/>
+              </w:rPr>
+              <w:t>}}</w:t>
             </w:r>
           </w:p>
         </w:tc>
@@ -4821,7 +5349,7 @@
         </w:trPr>
         <w:tc>
           <w:tcPr>
-            <w:tcW w:w="6851" w:type="dxa"/>
+            <w:tcW w:w="5636" w:type="dxa"/>
             <w:gridSpan w:val="2"/>
             <w:shd w:val="clear" w:color="auto" w:fill="FFFFFF"/>
             <w:vAlign w:val="center"/>
@@ -4850,14 +5378,13 @@
                 <w:color w:val="808080"/>
                 <w:szCs w:val="18"/>
               </w:rPr>
-              <w:lastRenderedPageBreak/>
               <w:t>Mois Concerné</w:t>
             </w:r>
           </w:p>
         </w:tc>
         <w:tc>
           <w:tcPr>
-            <w:tcW w:w="840" w:type="dxa"/>
+            <w:tcW w:w="2163" w:type="dxa"/>
             <w:shd w:val="clear" w:color="auto" w:fill="FFFFFF"/>
             <w:vAlign w:val="center"/>
           </w:tcPr>
@@ -4880,18 +5407,56 @@
               <w:rPr>
                 <w:rFonts w:ascii="Calibri" w:hAnsi="Calibri" w:cs="Calibri"/>
                 <w:b/>
-                <w:i/>
-                <w:iCs/>
-                <w:color w:val="808080"/>
-                <w:szCs w:val="18"/>
-              </w:rPr>
-              <w:t>Mars</w:t>
+                <w:color w:val="000000"/>
+                <w:szCs w:val="18"/>
+              </w:rPr>
+              <w:t>{{data[-1</w:t>
+            </w:r>
+            <w:proofErr w:type="gramStart"/>
+            <w:r>
+              <w:rPr>
+                <w:rFonts w:ascii="Calibri" w:hAnsi="Calibri" w:cs="Calibri"/>
+                <w:b/>
+                <w:color w:val="000000"/>
+                <w:szCs w:val="18"/>
+              </w:rPr>
+              <w:t>].</w:t>
+            </w:r>
+            <w:proofErr w:type="spellStart"/>
+            <w:r>
+              <w:rPr>
+                <w:rFonts w:ascii="Calibri" w:hAnsi="Calibri" w:cs="Calibri"/>
+                <w:b/>
+                <w:color w:val="000000"/>
+                <w:szCs w:val="18"/>
+              </w:rPr>
+              <w:t>min</w:t>
+            </w:r>
+            <w:proofErr w:type="gramEnd"/>
+            <w:r>
+              <w:rPr>
+                <w:rFonts w:ascii="Calibri" w:hAnsi="Calibri" w:cs="Calibri"/>
+                <w:b/>
+                <w:color w:val="000000"/>
+                <w:szCs w:val="18"/>
+              </w:rPr>
+              <w:t>_month</w:t>
+            </w:r>
+            <w:proofErr w:type="spellEnd"/>
+            <w:r>
+              <w:rPr>
+                <w:rFonts w:ascii="Calibri" w:hAnsi="Calibri" w:cs="Calibri"/>
+                <w:b/>
+                <w:color w:val="000000"/>
+                <w:szCs w:val="18"/>
+              </w:rPr>
+              <w:t>}}</w:t>
             </w:r>
           </w:p>
         </w:tc>
         <w:tc>
           <w:tcPr>
-            <w:tcW w:w="840" w:type="dxa"/>
+            <w:tcW w:w="2197" w:type="dxa"/>
             <w:shd w:val="clear" w:color="auto" w:fill="FFFFFF"/>
             <w:vAlign w:val="center"/>
           </w:tcPr>
@@ -4914,12 +5479,30 @@
               <w:rPr>
                 <w:rFonts w:ascii="Calibri" w:hAnsi="Calibri" w:cs="Calibri"/>
                 <w:b/>
-                <w:i/>
-                <w:iCs/>
-                <w:color w:val="808080"/>
-                <w:szCs w:val="18"/>
-              </w:rPr>
-              <w:t>Juin</w:t>
+                <w:color w:val="000000"/>
+                <w:szCs w:val="18"/>
+              </w:rPr>
+              <w:t>{{data[-1].</w:t>
+            </w:r>
+            <w:proofErr w:type="spellStart"/>
+            <w:r>
+              <w:rPr>
+                <w:rFonts w:ascii="Calibri" w:hAnsi="Calibri" w:cs="Calibri"/>
+                <w:b/>
+                <w:color w:val="000000"/>
+                <w:szCs w:val="18"/>
+              </w:rPr>
+              <w:t>max_month</w:t>
+            </w:r>
+            <w:proofErr w:type="spellEnd"/>
+            <w:r>
+              <w:rPr>
+                <w:rFonts w:ascii="Calibri" w:hAnsi="Calibri" w:cs="Calibri"/>
+                <w:b/>
+                <w:color w:val="000000"/>
+                <w:szCs w:val="18"/>
+              </w:rPr>
+              <w:t>}}</w:t>
             </w:r>
           </w:p>
         </w:tc>
@@ -4994,6 +5577,14 @@
           <w:szCs w:val="22"/>
         </w:rPr>
       </w:pPr>
+      <w:r>
+        <w:rPr>
+          <w:rFonts w:ascii="Arial" w:hAnsi="Arial" w:cs="Arial"/>
+          <w:sz w:val="22"/>
+          <w:szCs w:val="22"/>
+        </w:rPr>
+        <w:tab/>
+      </w:r>
     </w:p>
     <w:p>
       <w:pPr>
@@ -5834,7 +6425,6 @@
           <w:sz w:val="22"/>
           <w:szCs w:val="22"/>
         </w:rPr>
-        <w:lastRenderedPageBreak/>
         <w:t xml:space="preserve">Le facteur de puissance global de l’installation varie entre </w:t>
       </w:r>
       <w:r>
@@ -5845,7 +6435,51 @@
           <w:szCs w:val="22"/>
           <w:u w:val="single"/>
         </w:rPr>
-        <w:t>0,88</w:t>
+        <w:t>{{data[-1</w:t>
+      </w:r>
+      <w:proofErr w:type="gramStart"/>
+      <w:r>
+        <w:rPr>
+          <w:rFonts w:ascii="Arial" w:hAnsi="Arial" w:cs="Arial"/>
+          <w:b/>
+          <w:sz w:val="22"/>
+          <w:szCs w:val="22"/>
+          <w:u w:val="single"/>
+        </w:rPr>
+        <w:t>].</w:t>
+      </w:r>
+      <w:proofErr w:type="spellStart"/>
+      <w:r>
+        <w:rPr>
+          <w:rFonts w:ascii="Arial" w:hAnsi="Arial" w:cs="Arial"/>
+          <w:b/>
+          <w:sz w:val="22"/>
+          <w:szCs w:val="22"/>
+          <w:u w:val="single"/>
+        </w:rPr>
+        <w:t>min</w:t>
+      </w:r>
+      <w:proofErr w:type="gramEnd"/>
+      <w:r>
+        <w:rPr>
+          <w:rFonts w:ascii="Arial" w:hAnsi="Arial" w:cs="Arial"/>
+          <w:b/>
+          <w:sz w:val="22"/>
+          <w:szCs w:val="22"/>
+          <w:u w:val="single"/>
+        </w:rPr>
+        <w:t>_CosPhi</w:t>
+      </w:r>
+      <w:proofErr w:type="spellEnd"/>
+      <w:r>
+        <w:rPr>
+          <w:rFonts w:ascii="Arial" w:hAnsi="Arial" w:cs="Arial"/>
+          <w:b/>
+          <w:sz w:val="22"/>
+          <w:szCs w:val="22"/>
+          <w:u w:val="single"/>
+        </w:rPr>
+        <w:t>}}</w:t>
       </w:r>
       <w:r>
         <w:rPr>
@@ -5859,47 +6493,87 @@
         <w:rPr>
           <w:rFonts w:ascii="Arial" w:hAnsi="Arial" w:cs="Arial"/>
           <w:b/>
+          <w:bCs/>
           <w:sz w:val="22"/>
           <w:szCs w:val="22"/>
           <w:u w:val="single"/>
         </w:rPr>
-        <w:t>0,</w:t>
-      </w:r>
-      <w:r>
-        <w:rPr>
-          <w:rFonts w:ascii="Arial" w:hAnsi="Arial" w:cs="Arial"/>
-          <w:b/>
+        <w:t>{{data[-1].</w:t>
+      </w:r>
+      <w:proofErr w:type="spellStart"/>
+      <w:r>
+        <w:rPr>
+          <w:rFonts w:ascii="Arial" w:hAnsi="Arial" w:cs="Arial"/>
+          <w:b/>
+          <w:bCs/>
           <w:sz w:val="22"/>
           <w:szCs w:val="22"/>
           <w:u w:val="single"/>
         </w:rPr>
-        <w:t>97</w:t>
-      </w:r>
-      <w:r>
-        <w:rPr>
-          <w:rFonts w:ascii="Arial" w:hAnsi="Arial" w:cs="Arial"/>
-          <w:sz w:val="22"/>
-          <w:szCs w:val="22"/>
-        </w:rPr>
-        <w:t xml:space="preserve">, avec une valeur moyenne de </w:t>
-      </w:r>
-      <w:r>
-        <w:rPr>
-          <w:rFonts w:ascii="Arial" w:hAnsi="Arial" w:cs="Arial"/>
-          <w:b/>
-          <w:sz w:val="22"/>
-          <w:szCs w:val="22"/>
-        </w:rPr>
-        <w:t>0,</w:t>
-      </w:r>
-      <w:r>
-        <w:rPr>
-          <w:rFonts w:ascii="Arial" w:hAnsi="Arial" w:cs="Arial"/>
-          <w:b/>
-          <w:sz w:val="22"/>
-          <w:szCs w:val="22"/>
-        </w:rPr>
-        <w:t>95</w:t>
+        <w:t>max_CosPhi</w:t>
+      </w:r>
+      <w:proofErr w:type="spellEnd"/>
+      <w:r>
+        <w:rPr>
+          <w:rFonts w:ascii="Arial" w:hAnsi="Arial" w:cs="Arial"/>
+          <w:b/>
+          <w:bCs/>
+          <w:sz w:val="22"/>
+          <w:szCs w:val="22"/>
+          <w:u w:val="single"/>
+        </w:rPr>
+        <w:t>}}</w:t>
+      </w:r>
+      <w:r>
+        <w:rPr>
+          <w:rFonts w:ascii="Arial" w:hAnsi="Arial" w:cs="Arial"/>
+          <w:b/>
+          <w:bCs/>
+          <w:sz w:val="22"/>
+          <w:szCs w:val="22"/>
+          <w:u w:val="single"/>
+        </w:rPr>
+        <w:t xml:space="preserve">, </w:t>
+      </w:r>
+      <w:r>
+        <w:rPr>
+          <w:rFonts w:ascii="Arial" w:hAnsi="Arial" w:cs="Arial"/>
+          <w:sz w:val="22"/>
+          <w:szCs w:val="22"/>
+        </w:rPr>
+        <w:t xml:space="preserve">avec une valeur moyenne de </w:t>
+      </w:r>
+      <w:r>
+        <w:rPr>
+          <w:rFonts w:ascii="Arial" w:hAnsi="Arial" w:cs="Arial"/>
+          <w:b/>
+          <w:sz w:val="22"/>
+          <w:szCs w:val="22"/>
+          <w:u w:val="single"/>
+        </w:rPr>
+        <w:t>{{data[-1].</w:t>
+      </w:r>
+      <w:proofErr w:type="spellStart"/>
+      <w:r>
+        <w:rPr>
+          <w:rFonts w:ascii="Arial" w:hAnsi="Arial" w:cs="Arial"/>
+          <w:b/>
+          <w:sz w:val="22"/>
+          <w:szCs w:val="22"/>
+          <w:u w:val="single"/>
+        </w:rPr>
+        <w:t>average_CosPhi</w:t>
+      </w:r>
+      <w:proofErr w:type="spellEnd"/>
+      <w:r>
+        <w:rPr>
+          <w:rFonts w:ascii="Arial" w:hAnsi="Arial" w:cs="Arial"/>
+          <w:b/>
+          <w:sz w:val="22"/>
+          <w:szCs w:val="22"/>
+          <w:u w:val="single"/>
+        </w:rPr>
+        <w:t>}}</w:t>
       </w:r>
       <w:r>
         <w:rPr>
@@ -6442,6 +7116,141 @@
     </w:p>
     <w:p>
       <w:pPr>
+        <w:spacing w:line="276" w:lineRule="auto"/>
+        <w:ind w:left="142"/>
+        <w:rPr>
+          <w:rFonts w:ascii="Arial" w:hAnsi="Arial" w:cs="Arial"/>
+          <w:b/>
+        </w:rPr>
+      </w:pPr>
+    </w:p>
+    <w:p>
+      <w:pPr>
+        <w:spacing w:line="276" w:lineRule="auto"/>
+        <w:ind w:left="142"/>
+        <w:rPr>
+          <w:rFonts w:ascii="Arial" w:hAnsi="Arial" w:cs="Arial"/>
+          <w:b/>
+        </w:rPr>
+      </w:pPr>
+    </w:p>
+    <w:p>
+      <w:pPr>
+        <w:spacing w:line="276" w:lineRule="auto"/>
+        <w:ind w:left="142"/>
+        <w:rPr>
+          <w:rFonts w:ascii="Arial" w:hAnsi="Arial" w:cs="Arial"/>
+          <w:b/>
+        </w:rPr>
+      </w:pPr>
+    </w:p>
+    <w:p>
+      <w:pPr>
+        <w:spacing w:line="276" w:lineRule="auto"/>
+        <w:ind w:left="142"/>
+        <w:rPr>
+          <w:rFonts w:ascii="Arial" w:hAnsi="Arial" w:cs="Arial"/>
+          <w:b/>
+        </w:rPr>
+      </w:pPr>
+    </w:p>
+    <w:p>
+      <w:pPr>
+        <w:spacing w:line="276" w:lineRule="auto"/>
+        <w:ind w:left="142"/>
+        <w:rPr>
+          <w:rFonts w:ascii="Arial" w:hAnsi="Arial" w:cs="Arial"/>
+          <w:b/>
+        </w:rPr>
+      </w:pPr>
+    </w:p>
+    <w:p>
+      <w:pPr>
+        <w:spacing w:line="276" w:lineRule="auto"/>
+        <w:ind w:left="142"/>
+        <w:rPr>
+          <w:rFonts w:ascii="Arial" w:hAnsi="Arial" w:cs="Arial"/>
+          <w:b/>
+        </w:rPr>
+      </w:pPr>
+    </w:p>
+    <w:p>
+      <w:pPr>
+        <w:autoSpaceDE w:val="0"/>
+        <w:autoSpaceDN w:val="0"/>
+        <w:adjustRightInd w:val="0"/>
+        <w:spacing w:line="360" w:lineRule="auto"/>
+        <w:ind w:firstLine="720"/>
+        <w:jc w:val="both"/>
+        <w:rPr>
+          <w:rFonts w:ascii="Arial" w:hAnsi="Arial" w:cs="Arial"/>
+          <w:sz w:val="22"/>
+          <w:szCs w:val="22"/>
+        </w:rPr>
+      </w:pPr>
+      <w:r>
+        <w:rPr>
+          <w:rFonts w:ascii="Arial" w:hAnsi="Arial" w:cs="Arial"/>
+          <w:sz w:val="22"/>
+          <w:szCs w:val="22"/>
+        </w:rPr>
+        <w:lastRenderedPageBreak/>
+        <w:t>{{</w:t>
+      </w:r>
+      <w:proofErr w:type="gramStart"/>
+      <w:r>
+        <w:rPr>
+          <w:rFonts w:ascii="Arial" w:hAnsi="Arial" w:cs="Arial"/>
+          <w:sz w:val="22"/>
+          <w:szCs w:val="22"/>
+        </w:rPr>
+        <w:t>data[</w:t>
+      </w:r>
+      <w:proofErr w:type="gramEnd"/>
+      <w:r>
+        <w:rPr>
+          <w:rFonts w:ascii="Arial" w:hAnsi="Arial" w:cs="Arial"/>
+          <w:sz w:val="22"/>
+          <w:szCs w:val="22"/>
+        </w:rPr>
+        <w:t>-1].</w:t>
+      </w:r>
+      <w:r>
+        <w:t xml:space="preserve"> </w:t>
+      </w:r>
+      <w:proofErr w:type="spellStart"/>
+      <w:proofErr w:type="gramStart"/>
+      <w:r>
+        <w:rPr>
+          <w:rFonts w:ascii="Arial" w:hAnsi="Arial" w:cs="Arial"/>
+          <w:sz w:val="22"/>
+          <w:szCs w:val="22"/>
+        </w:rPr>
+        <w:t>psaChart</w:t>
+      </w:r>
+      <w:proofErr w:type="spellEnd"/>
+      <w:proofErr w:type="gramEnd"/>
+      <w:r>
+        <w:rPr>
+          <w:rFonts w:ascii="Arial" w:hAnsi="Arial" w:cs="Arial"/>
+          <w:sz w:val="22"/>
+          <w:szCs w:val="22"/>
+        </w:rPr>
+        <w:t>}}</w:t>
+      </w:r>
+    </w:p>
+    <w:p>
+      <w:pPr>
+        <w:spacing w:line="276" w:lineRule="auto"/>
+        <w:ind w:left="142"/>
+        <w:rPr>
+          <w:rFonts w:ascii="Arial" w:hAnsi="Arial" w:cs="Arial"/>
+          <w:b/>
+        </w:rPr>
+      </w:pPr>
+    </w:p>
+    <w:p>
+      <w:pPr>
         <w:shd w:val="clear" w:color="auto" w:fill="FFFFFF"/>
         <w:spacing w:line="276" w:lineRule="auto"/>
         <w:ind w:left="142"/>
@@ -6454,67 +7263,9 @@
           <w:sz w:val="22"/>
           <w:szCs w:val="22"/>
           <w:u w:val="single"/>
-        </w:rPr>
-      </w:pPr>
-      <w:r>
-        <w:rPr>
-          <w:rFonts w:ascii="Arial" w:hAnsi="Arial" w:cs="Arial"/>
-          <w:bCs/>
-          <w:noProof/>
-          <w:color w:val="000000"/>
-          <w:spacing w:val="-2"/>
-          <w:sz w:val="22"/>
-          <w:szCs w:val="22"/>
-        </w:rPr>
-        <w:drawing>
-          <wp:inline distT="0" distB="0" distL="0" distR="0" wp14:anchorId="6890EE6D" wp14:editId="568FF85E">
-            <wp:extent cx="5200650" cy="2457450"/>
-            <wp:effectExtent l="0" t="0" r="0" b="0"/>
-            <wp:docPr id="2021919540" name="Picture 1" descr="A graph of green bars&#10;&#10;Description automatically generated"/>
-            <wp:cNvGraphicFramePr>
-              <a:graphicFrameLocks xmlns:a="http://schemas.openxmlformats.org/drawingml/2006/main" noChangeAspect="1"/>
-            </wp:cNvGraphicFramePr>
-            <a:graphic xmlns:a="http://schemas.openxmlformats.org/drawingml/2006/main">
-              <a:graphicData uri="http://schemas.openxmlformats.org/drawingml/2006/picture">
-                <pic:pic xmlns:pic="http://schemas.openxmlformats.org/drawingml/2006/picture">
-                  <pic:nvPicPr>
-                    <pic:cNvPr id="2021919540" name="Picture 1" descr="A graph of green bars&#10;&#10;Description automatically generated"/>
-                    <pic:cNvPicPr>
-                      <a:picLocks noChangeAspect="1" noChangeArrowheads="1"/>
-                    </pic:cNvPicPr>
-                  </pic:nvPicPr>
-                  <pic:blipFill>
-                    <a:blip r:embed="rId9">
-                      <a:extLst>
-                        <a:ext uri="{28A0092B-C50C-407E-A947-70E740481C1C}">
-                          <a14:useLocalDpi xmlns:a14="http://schemas.microsoft.com/office/drawing/2010/main" val="0"/>
-                        </a:ext>
-                      </a:extLst>
-                    </a:blip>
-                    <a:srcRect/>
-                    <a:stretch>
-                      <a:fillRect/>
-                    </a:stretch>
-                  </pic:blipFill>
-                  <pic:spPr bwMode="auto">
-                    <a:xfrm>
-                      <a:off x="0" y="0"/>
-                      <a:ext cx="5200650" cy="2457450"/>
-                    </a:xfrm>
-                    <a:prstGeom prst="rect">
-                      <a:avLst/>
-                    </a:prstGeom>
-                    <a:noFill/>
-                    <a:ln>
-                      <a:noFill/>
-                    </a:ln>
-                  </pic:spPr>
-                </pic:pic>
-              </a:graphicData>
-            </a:graphic>
-          </wp:inline>
-        </w:drawing>
-      </w:r>
+          <w:lang w:val="fr-MA"/>
+        </w:rPr>
+      </w:pPr>
     </w:p>
     <w:p>
       <w:pPr>
@@ -6553,7 +7304,6 @@
           <w:sz w:val="22"/>
           <w:szCs w:val="22"/>
         </w:rPr>
-        <w:lastRenderedPageBreak/>
         <w:t xml:space="preserve">D’après l’analyse des appels de puissance maximal (à CosPhi actuel) la puissance maximale atteinte (en KVA) étant de </w:t>
       </w:r>
       <w:r>
@@ -7601,7 +8351,7 @@
         <v:path o:extrusionok="f" gradientshapeok="t" o:connecttype="rect"/>
         <o:lock v:ext="edit" aspectratio="t"/>
       </v:shapetype>
-      <v:shape id="_x0000_i1099" type="#_x0000_t75" style="width:9.25pt;height:9.25pt" o:bullet="t">
+      <v:shape id="_x0000_i1201" type="#_x0000_t75" style="width:9.25pt;height:9.25pt" o:bullet="t">
         <v:imagedata r:id="rId1" o:title=""/>
       </v:shape>
     </w:pict>
@@ -8670,7 +9420,6 @@
   <w:style w:type="character" w:default="1" w:styleId="DefaultParagraphFont">
     <w:name w:val="Default Paragraph Font"/>
     <w:uiPriority w:val="1"/>
-    <w:semiHidden/>
     <w:unhideWhenUsed/>
   </w:style>
   <w:style w:type="table" w:default="1" w:styleId="TableNormal">
@@ -9385,4 +10134,16 @@
     </a:ext>
   </a:extLst>
 </a:theme>
+</file>
+
+<file path=customXml/item1.xml><?xml version="1.0" encoding="utf-8"?>
+<b:Sources xmlns:b="http://schemas.openxmlformats.org/officeDocument/2006/bibliography" xmlns="http://schemas.openxmlformats.org/officeDocument/2006/bibliography" SelectedStyle="\APASixthEditionOfficeOnline.xsl" StyleName="APA" Version="6"/>
+</file>
+
+<file path=customXml/itemProps1.xml><?xml version="1.0" encoding="utf-8"?>
+<ds:datastoreItem xmlns:ds="http://schemas.openxmlformats.org/officeDocument/2006/customXml" ds:itemID="{ABC14F45-997F-4FEA-B6EB-B0317E61F4B5}">
+  <ds:schemaRefs>
+    <ds:schemaRef ds:uri="http://schemas.openxmlformats.org/officeDocument/2006/bibliography"/>
+  </ds:schemaRefs>
+</ds:datastoreItem>
 </file>
</xml_diff>